<commit_message>
Fix Spark Kafka streaming + sender + dashboard sync
</commit_message>
<xml_diff>
--- a/КАЛЕНДАРНО_YOUSSOUF.docx
+++ b/КАЛЕНДАРНО_YOUSSOUF.docx
@@ -389,7 +389,6 @@
         <w:t xml:space="preserve"> </w:t>
       </w:r>
       <w:proofErr w:type="spellStart"/>
-      <w:proofErr w:type="gramStart"/>
       <w:r>
         <w:rPr>
           <w:rFonts w:ascii="Times New Roman" w:hAnsi="Times New Roman" w:cs="Times New Roman"/>
@@ -407,7 +406,6 @@
         </w:rPr>
         <w:t>:</w:t>
       </w:r>
-      <w:proofErr w:type="gramEnd"/>
     </w:p>
     <w:p>
       <w:pPr>
@@ -1022,7 +1020,6 @@
         </w:rPr>
       </w:pPr>
       <w:proofErr w:type="spellStart"/>
-      <w:proofErr w:type="gramStart"/>
       <w:r>
         <w:rPr>
           <w:rFonts w:ascii="Times New Roman" w:hAnsi="Times New Roman" w:cs="Times New Roman"/>
@@ -1032,7 +1029,6 @@
         <w:t>видеопотоки</w:t>
       </w:r>
       <w:proofErr w:type="spellEnd"/>
-      <w:proofErr w:type="gramEnd"/>
       <w:r>
         <w:rPr>
           <w:rFonts w:ascii="Times New Roman" w:hAnsi="Times New Roman" w:cs="Times New Roman"/>
@@ -1048,16 +1044,7 @@
           <w:sz w:val="28"/>
           <w:szCs w:val="28"/>
         </w:rPr>
-        <w:t>веб-</w:t>
-      </w:r>
-      <w:proofErr w:type="gramStart"/>
-      <w:r>
-        <w:rPr>
-          <w:rFonts w:ascii="Times New Roman" w:hAnsi="Times New Roman" w:cs="Times New Roman"/>
-          <w:sz w:val="28"/>
-          <w:szCs w:val="28"/>
-        </w:rPr>
-        <w:t>камеры</w:t>
+        <w:t>веб-камеры</w:t>
       </w:r>
       <w:proofErr w:type="spellEnd"/>
       <w:r>
@@ -1068,7 +1055,6 @@
         </w:rPr>
         <w:t>;</w:t>
       </w:r>
-      <w:proofErr w:type="gramEnd"/>
     </w:p>
     <w:p>
       <w:pPr>
@@ -1083,7 +1069,6 @@
         </w:rPr>
       </w:pPr>
       <w:proofErr w:type="spellStart"/>
-      <w:proofErr w:type="gramStart"/>
       <w:r>
         <w:rPr>
           <w:rFonts w:ascii="Times New Roman" w:hAnsi="Times New Roman" w:cs="Times New Roman"/>
@@ -1093,25 +1078,14 @@
         <w:t>видеофайлы</w:t>
       </w:r>
       <w:proofErr w:type="spellEnd"/>
-      <w:proofErr w:type="gramEnd"/>
-      <w:r>
-        <w:rPr>
-          <w:rFonts w:ascii="Times New Roman" w:hAnsi="Times New Roman" w:cs="Times New Roman"/>
-          <w:sz w:val="28"/>
-          <w:szCs w:val="28"/>
-        </w:rPr>
-        <w:t xml:space="preserve"> (MP4, AVI</w:t>
-      </w:r>
-      <w:proofErr w:type="gramStart"/>
-      <w:r>
-        <w:rPr>
-          <w:rFonts w:ascii="Times New Roman" w:hAnsi="Times New Roman" w:cs="Times New Roman"/>
-          <w:sz w:val="28"/>
-          <w:szCs w:val="28"/>
-        </w:rPr>
-        <w:t>);</w:t>
-      </w:r>
-      <w:proofErr w:type="gramEnd"/>
+      <w:r>
+        <w:rPr>
+          <w:rFonts w:ascii="Times New Roman" w:hAnsi="Times New Roman" w:cs="Times New Roman"/>
+          <w:sz w:val="28"/>
+          <w:szCs w:val="28"/>
+        </w:rPr>
+        <w:t xml:space="preserve"> (MP4, AVI);</w:t>
+      </w:r>
     </w:p>
     <w:p>
       <w:pPr>
@@ -1179,7 +1153,6 @@
         <w:t>возможности</w:t>
       </w:r>
       <w:proofErr w:type="spellEnd"/>
-      <w:proofErr w:type="gramStart"/>
       <w:r>
         <w:rPr>
           <w:rFonts w:ascii="Times New Roman" w:hAnsi="Times New Roman" w:cs="Times New Roman"/>
@@ -1188,7 +1161,6 @@
         </w:rPr>
         <w:t>);</w:t>
       </w:r>
-      <w:proofErr w:type="gramEnd"/>
     </w:p>
     <w:p>
       <w:pPr>
@@ -1285,7 +1257,6 @@
         </w:rPr>
       </w:pPr>
       <w:proofErr w:type="spellStart"/>
-      <w:proofErr w:type="gramStart"/>
       <w:r>
         <w:rPr>
           <w:rFonts w:ascii="Times New Roman" w:hAnsi="Times New Roman" w:cs="Times New Roman"/>
@@ -1295,7 +1266,6 @@
         <w:t>временная</w:t>
       </w:r>
       <w:proofErr w:type="spellEnd"/>
-      <w:proofErr w:type="gramEnd"/>
       <w:r>
         <w:rPr>
           <w:rFonts w:ascii="Times New Roman" w:hAnsi="Times New Roman" w:cs="Times New Roman"/>
@@ -1336,7 +1306,6 @@
         </w:rPr>
       </w:pPr>
       <w:proofErr w:type="spellStart"/>
-      <w:proofErr w:type="gramStart"/>
       <w:r>
         <w:rPr>
           <w:rFonts w:ascii="Times New Roman" w:hAnsi="Times New Roman" w:cs="Times New Roman"/>
@@ -1346,7 +1315,6 @@
         <w:t>идентификатор</w:t>
       </w:r>
       <w:proofErr w:type="spellEnd"/>
-      <w:proofErr w:type="gramEnd"/>
       <w:r>
         <w:rPr>
           <w:rFonts w:ascii="Times New Roman" w:hAnsi="Times New Roman" w:cs="Times New Roman"/>
@@ -1405,7 +1373,6 @@
         </w:rPr>
       </w:pPr>
       <w:proofErr w:type="spellStart"/>
-      <w:proofErr w:type="gramStart"/>
       <w:r>
         <w:rPr>
           <w:rFonts w:ascii="Times New Roman" w:hAnsi="Times New Roman" w:cs="Times New Roman"/>
@@ -1415,7 +1382,6 @@
         <w:t>предсказанная</w:t>
       </w:r>
       <w:proofErr w:type="spellEnd"/>
-      <w:proofErr w:type="gramEnd"/>
       <w:r>
         <w:rPr>
           <w:rFonts w:ascii="Times New Roman" w:hAnsi="Times New Roman" w:cs="Times New Roman"/>
@@ -1456,7 +1422,6 @@
         </w:rPr>
       </w:pPr>
       <w:proofErr w:type="spellStart"/>
-      <w:proofErr w:type="gramStart"/>
       <w:r>
         <w:rPr>
           <w:rFonts w:ascii="Times New Roman" w:hAnsi="Times New Roman" w:cs="Times New Roman"/>
@@ -1466,7 +1431,6 @@
         <w:t>вероятность</w:t>
       </w:r>
       <w:proofErr w:type="spellEnd"/>
-      <w:proofErr w:type="gramEnd"/>
       <w:r>
         <w:rPr>
           <w:rFonts w:ascii="Times New Roman" w:hAnsi="Times New Roman" w:cs="Times New Roman"/>
@@ -1489,7 +1453,6 @@
         </w:rPr>
       </w:pPr>
       <w:proofErr w:type="spellStart"/>
-      <w:proofErr w:type="gramStart"/>
       <w:r>
         <w:rPr>
           <w:rFonts w:ascii="Times New Roman" w:hAnsi="Times New Roman" w:cs="Times New Roman"/>
@@ -1499,7 +1462,6 @@
         <w:t>координаты</w:t>
       </w:r>
       <w:proofErr w:type="spellEnd"/>
-      <w:proofErr w:type="gramEnd"/>
       <w:r>
         <w:rPr>
           <w:rFonts w:ascii="Times New Roman" w:hAnsi="Times New Roman" w:cs="Times New Roman"/>
@@ -1558,7 +1520,6 @@
         </w:rPr>
       </w:pPr>
       <w:proofErr w:type="spellStart"/>
-      <w:proofErr w:type="gramStart"/>
       <w:r>
         <w:rPr>
           <w:rFonts w:ascii="Times New Roman" w:hAnsi="Times New Roman" w:cs="Times New Roman"/>
@@ -1568,7 +1529,6 @@
         <w:t>при</w:t>
       </w:r>
       <w:proofErr w:type="spellEnd"/>
-      <w:proofErr w:type="gramEnd"/>
       <w:r>
         <w:rPr>
           <w:rFonts w:ascii="Times New Roman" w:hAnsi="Times New Roman" w:cs="Times New Roman"/>
@@ -3201,6 +3161,7 @@
             <w:rFonts w:ascii="Times New Roman" w:hAnsi="Times New Roman" w:cs="Times New Roman"/>
             <w:sz w:val="28"/>
             <w:szCs w:val="28"/>
+            <w:lang w:val="en-US"/>
           </w:rPr>
           <w:t>http</w:t>
         </w:r>
@@ -3220,6 +3181,7 @@
             <w:rFonts w:ascii="Times New Roman" w:hAnsi="Times New Roman" w:cs="Times New Roman"/>
             <w:sz w:val="28"/>
             <w:szCs w:val="28"/>
+            <w:lang w:val="en-US"/>
           </w:rPr>
           <w:t>www</w:t>
         </w:r>
@@ -3240,6 +3202,7 @@
             <w:rFonts w:ascii="Times New Roman" w:hAnsi="Times New Roman" w:cs="Times New Roman"/>
             <w:sz w:val="28"/>
             <w:szCs w:val="28"/>
+            <w:lang w:val="en-US"/>
           </w:rPr>
           <w:t>whdeng</w:t>
         </w:r>
@@ -3261,8 +3224,31 @@
             <w:rFonts w:ascii="Times New Roman" w:hAnsi="Times New Roman" w:cs="Times New Roman"/>
             <w:sz w:val="28"/>
             <w:szCs w:val="28"/>
+            <w:lang w:val="en-US"/>
           </w:rPr>
           <w:t>cn</w:t>
+        </w:r>
+        <w:proofErr w:type="spellEnd"/>
+        <w:r>
+          <w:rPr>
+            <w:rStyle w:val="Lienhypertexte"/>
+            <w:rFonts w:ascii="Times New Roman" w:hAnsi="Times New Roman" w:cs="Times New Roman"/>
+            <w:sz w:val="28"/>
+            <w:szCs w:val="28"/>
+            <w:lang w:val="ru-RU"/>
+          </w:rPr>
+          <w:t>/</w:t>
+        </w:r>
+        <w:proofErr w:type="spellStart"/>
+        <w:r>
+          <w:rPr>
+            <w:rStyle w:val="Lienhypertexte"/>
+            <w:rFonts w:ascii="Times New Roman" w:hAnsi="Times New Roman" w:cs="Times New Roman"/>
+            <w:sz w:val="28"/>
+            <w:szCs w:val="28"/>
+            <w:lang w:val="en-US"/>
+          </w:rPr>
+          <w:t>raf</w:t>
         </w:r>
         <w:proofErr w:type="spellEnd"/>
         <w:r>
@@ -3281,25 +3267,7 @@
             <w:rFonts w:ascii="Times New Roman" w:hAnsi="Times New Roman" w:cs="Times New Roman"/>
             <w:sz w:val="28"/>
             <w:szCs w:val="28"/>
-          </w:rPr>
-          <w:t>raf</w:t>
-        </w:r>
-        <w:r>
-          <w:rPr>
-            <w:rStyle w:val="Lienhypertexte"/>
-            <w:rFonts w:ascii="Times New Roman" w:hAnsi="Times New Roman" w:cs="Times New Roman"/>
-            <w:sz w:val="28"/>
-            <w:szCs w:val="28"/>
-            <w:lang w:val="ru-RU"/>
-          </w:rPr>
-          <w:t>/</w:t>
-        </w:r>
-        <w:r>
-          <w:rPr>
-            <w:rStyle w:val="Lienhypertexte"/>
-            <w:rFonts w:ascii="Times New Roman" w:hAnsi="Times New Roman" w:cs="Times New Roman"/>
-            <w:sz w:val="28"/>
-            <w:szCs w:val="28"/>
+            <w:lang w:val="en-US"/>
           </w:rPr>
           <w:t>model</w:t>
         </w:r>
@@ -3319,6 +3287,7 @@
             <w:rFonts w:ascii="Times New Roman" w:hAnsi="Times New Roman" w:cs="Times New Roman"/>
             <w:sz w:val="28"/>
             <w:szCs w:val="28"/>
+            <w:lang w:val="en-US"/>
           </w:rPr>
           <w:t>html</w:t>
         </w:r>
@@ -3585,25 +3554,7 @@
           <w:sz w:val="28"/>
           <w:szCs w:val="28"/>
         </w:rPr>
-        <w:t xml:space="preserve"> </w:t>
-      </w:r>
-      <w:proofErr w:type="gramStart"/>
-      <w:r>
-        <w:rPr>
-          <w:rFonts w:ascii="Times New Roman" w:hAnsi="Times New Roman" w:cs="Times New Roman"/>
-          <w:sz w:val="28"/>
-          <w:szCs w:val="28"/>
-        </w:rPr>
-        <w:t>1:</w:t>
-      </w:r>
-      <w:proofErr w:type="gramEnd"/>
-      <w:r>
-        <w:rPr>
-          <w:rFonts w:ascii="Times New Roman" w:hAnsi="Times New Roman" w:cs="Times New Roman"/>
-          <w:sz w:val="28"/>
-          <w:szCs w:val="28"/>
-        </w:rPr>
-        <w:t xml:space="preserve"> FER-2013 (</w:t>
+        <w:t xml:space="preserve"> 1: FER-2013 (</w:t>
       </w:r>
       <w:proofErr w:type="spellStart"/>
       <w:r>
@@ -3885,7 +3836,6 @@
         </w:rPr>
       </w:pPr>
       <w:proofErr w:type="spellStart"/>
-      <w:proofErr w:type="gramStart"/>
       <w:r>
         <w:rPr>
           <w:rFonts w:ascii="Times New Roman" w:hAnsi="Times New Roman" w:cs="Times New Roman"/>
@@ -3901,16 +3851,7 @@
           <w:sz w:val="28"/>
           <w:szCs w:val="28"/>
         </w:rPr>
-        <w:t>:</w:t>
-      </w:r>
-      <w:proofErr w:type="gramEnd"/>
-      <w:r>
-        <w:rPr>
-          <w:rFonts w:ascii="Times New Roman" w:hAnsi="Times New Roman" w:cs="Times New Roman"/>
-          <w:sz w:val="28"/>
-          <w:szCs w:val="28"/>
-        </w:rPr>
-        <w:t xml:space="preserve"> </w:t>
+        <w:t xml:space="preserve">: </w:t>
       </w:r>
       <w:hyperlink r:id="rId9" w:tgtFrame="_new" w:history="1">
         <w:r>
@@ -3983,7 +3924,6 @@
         </w:rPr>
       </w:pPr>
       <w:proofErr w:type="spellStart"/>
-      <w:proofErr w:type="gramStart"/>
       <w:r>
         <w:rPr>
           <w:rFonts w:ascii="Times New Roman" w:hAnsi="Times New Roman" w:cs="Times New Roman"/>
@@ -3999,16 +3939,7 @@
           <w:sz w:val="28"/>
           <w:szCs w:val="28"/>
         </w:rPr>
-        <w:t>:</w:t>
-      </w:r>
-      <w:proofErr w:type="gramEnd"/>
-      <w:r>
-        <w:rPr>
-          <w:rFonts w:ascii="Times New Roman" w:hAnsi="Times New Roman" w:cs="Times New Roman"/>
-          <w:sz w:val="28"/>
-          <w:szCs w:val="28"/>
-        </w:rPr>
-        <w:t xml:space="preserve"> </w:t>
+        <w:t xml:space="preserve">: </w:t>
       </w:r>
       <w:hyperlink r:id="rId11" w:tgtFrame="_new" w:history="1">
         <w:r>
@@ -4189,7 +4120,6 @@
         </w:rPr>
       </w:pPr>
       <w:proofErr w:type="spellStart"/>
-      <w:proofErr w:type="gramStart"/>
       <w:r>
         <w:rPr>
           <w:rFonts w:ascii="Times New Roman" w:hAnsi="Times New Roman" w:cs="Times New Roman"/>
@@ -4199,7 +4129,6 @@
         <w:t>torchvision</w:t>
       </w:r>
       <w:proofErr w:type="spellEnd"/>
-      <w:proofErr w:type="gramEnd"/>
       <w:r>
         <w:rPr>
           <w:rFonts w:ascii="Times New Roman" w:hAnsi="Times New Roman" w:cs="Times New Roman"/>
@@ -4209,7 +4138,6 @@
         <w:t xml:space="preserve">, </w:t>
       </w:r>
       <w:proofErr w:type="spellStart"/>
-      <w:proofErr w:type="gramStart"/>
       <w:r>
         <w:rPr>
           <w:rFonts w:ascii="Times New Roman" w:hAnsi="Times New Roman" w:cs="Times New Roman"/>
@@ -4225,16 +4153,7 @@
           <w:sz w:val="28"/>
           <w:szCs w:val="28"/>
         </w:rPr>
-        <w:t>:</w:t>
-      </w:r>
-      <w:proofErr w:type="gramEnd"/>
-      <w:r>
-        <w:rPr>
-          <w:rFonts w:ascii="Times New Roman" w:hAnsi="Times New Roman" w:cs="Times New Roman"/>
-          <w:sz w:val="28"/>
-          <w:szCs w:val="28"/>
-        </w:rPr>
-        <w:t xml:space="preserve"> </w:t>
+        <w:t xml:space="preserve">: </w:t>
       </w:r>
       <w:hyperlink r:id="rId13" w:tgtFrame="_new" w:history="1">
         <w:r>
@@ -4261,7 +4180,6 @@
         </w:rPr>
       </w:pPr>
       <w:proofErr w:type="spellStart"/>
-      <w:proofErr w:type="gramStart"/>
       <w:r>
         <w:rPr>
           <w:rFonts w:ascii="Times New Roman" w:hAnsi="Times New Roman" w:cs="Times New Roman"/>
@@ -4277,16 +4195,7 @@
           <w:sz w:val="28"/>
           <w:szCs w:val="28"/>
         </w:rPr>
-        <w:t>:</w:t>
-      </w:r>
-      <w:proofErr w:type="gramEnd"/>
-      <w:r>
-        <w:rPr>
-          <w:rFonts w:ascii="Times New Roman" w:hAnsi="Times New Roman" w:cs="Times New Roman"/>
-          <w:sz w:val="28"/>
-          <w:szCs w:val="28"/>
-        </w:rPr>
-        <w:t xml:space="preserve"> </w:t>
+        <w:t xml:space="preserve">: </w:t>
       </w:r>
       <w:hyperlink r:id="rId14" w:tgtFrame="_new" w:history="1">
         <w:r>
@@ -4589,25 +4498,7 @@
           <w:sz w:val="28"/>
           <w:szCs w:val="28"/>
         </w:rPr>
-        <w:t xml:space="preserve"> (Parquet</w:t>
-      </w:r>
-      <w:proofErr w:type="gramStart"/>
-      <w:r>
-        <w:rPr>
-          <w:rFonts w:ascii="Times New Roman" w:hAnsi="Times New Roman" w:cs="Times New Roman"/>
-          <w:sz w:val="28"/>
-          <w:szCs w:val="28"/>
-        </w:rPr>
-        <w:t>):</w:t>
-      </w:r>
-      <w:proofErr w:type="gramEnd"/>
-      <w:r>
-        <w:rPr>
-          <w:rFonts w:ascii="Times New Roman" w:hAnsi="Times New Roman" w:cs="Times New Roman"/>
-          <w:sz w:val="28"/>
-          <w:szCs w:val="28"/>
-        </w:rPr>
-        <w:t xml:space="preserve"> </w:t>
+        <w:t xml:space="preserve"> (Parquet): </w:t>
       </w:r>
       <w:hyperlink r:id="rId19" w:tgtFrame="_new" w:history="1">
         <w:r>
@@ -4668,23 +4559,13 @@
           <w:szCs w:val="28"/>
         </w:rPr>
       </w:pPr>
-      <w:proofErr w:type="gramStart"/>
-      <w:r>
-        <w:rPr>
-          <w:rFonts w:ascii="Times New Roman" w:hAnsi="Times New Roman" w:cs="Times New Roman"/>
-          <w:sz w:val="28"/>
-          <w:szCs w:val="28"/>
-        </w:rPr>
-        <w:t>Pandas:</w:t>
-      </w:r>
-      <w:proofErr w:type="gramEnd"/>
-      <w:r>
-        <w:rPr>
-          <w:rFonts w:ascii="Times New Roman" w:hAnsi="Times New Roman" w:cs="Times New Roman"/>
-          <w:sz w:val="28"/>
-          <w:szCs w:val="28"/>
-        </w:rPr>
-        <w:t xml:space="preserve"> </w:t>
+      <w:r>
+        <w:rPr>
+          <w:rFonts w:ascii="Times New Roman" w:hAnsi="Times New Roman" w:cs="Times New Roman"/>
+          <w:sz w:val="28"/>
+          <w:szCs w:val="28"/>
+        </w:rPr>
+        <w:t xml:space="preserve">Pandas: </w:t>
       </w:r>
       <w:hyperlink r:id="rId21" w:tgtFrame="_new" w:history="1">
         <w:r>
@@ -4790,7 +4671,6 @@
         </w:rPr>
       </w:pPr>
       <w:proofErr w:type="spellStart"/>
-      <w:proofErr w:type="gramStart"/>
       <w:r>
         <w:rPr>
           <w:rFonts w:ascii="Times New Roman" w:hAnsi="Times New Roman" w:cs="Times New Roman"/>
@@ -4806,16 +4686,7 @@
           <w:sz w:val="28"/>
           <w:szCs w:val="28"/>
         </w:rPr>
-        <w:t>:</w:t>
-      </w:r>
-      <w:proofErr w:type="gramEnd"/>
-      <w:r>
-        <w:rPr>
-          <w:rFonts w:ascii="Times New Roman" w:hAnsi="Times New Roman" w:cs="Times New Roman"/>
-          <w:sz w:val="28"/>
-          <w:szCs w:val="28"/>
-        </w:rPr>
-        <w:t xml:space="preserve"> </w:t>
+        <w:t xml:space="preserve">: </w:t>
       </w:r>
       <w:hyperlink r:id="rId23" w:tgtFrame="_new" w:history="1">
         <w:r>
@@ -4842,7 +4713,6 @@
         </w:rPr>
       </w:pPr>
       <w:proofErr w:type="spellStart"/>
-      <w:proofErr w:type="gramStart"/>
       <w:r>
         <w:rPr>
           <w:rFonts w:ascii="Times New Roman" w:hAnsi="Times New Roman" w:cs="Times New Roman"/>
@@ -4858,16 +4728,7 @@
           <w:sz w:val="28"/>
           <w:szCs w:val="28"/>
         </w:rPr>
-        <w:t>:</w:t>
-      </w:r>
-      <w:proofErr w:type="gramEnd"/>
-      <w:r>
-        <w:rPr>
-          <w:rFonts w:ascii="Times New Roman" w:hAnsi="Times New Roman" w:cs="Times New Roman"/>
-          <w:sz w:val="28"/>
-          <w:szCs w:val="28"/>
-        </w:rPr>
-        <w:t xml:space="preserve"> </w:t>
+        <w:t xml:space="preserve">: </w:t>
       </w:r>
       <w:hyperlink r:id="rId24" w:tgtFrame="_new" w:history="1">
         <w:r>
@@ -4894,7 +4755,6 @@
         </w:rPr>
       </w:pPr>
       <w:proofErr w:type="spellStart"/>
-      <w:proofErr w:type="gramStart"/>
       <w:r>
         <w:rPr>
           <w:rFonts w:ascii="Times New Roman" w:hAnsi="Times New Roman" w:cs="Times New Roman"/>
@@ -4910,16 +4770,7 @@
           <w:sz w:val="28"/>
           <w:szCs w:val="28"/>
         </w:rPr>
-        <w:t>:</w:t>
-      </w:r>
-      <w:proofErr w:type="gramEnd"/>
-      <w:r>
-        <w:rPr>
-          <w:rFonts w:ascii="Times New Roman" w:hAnsi="Times New Roman" w:cs="Times New Roman"/>
-          <w:sz w:val="28"/>
-          <w:szCs w:val="28"/>
-        </w:rPr>
-        <w:t xml:space="preserve"> </w:t>
+        <w:t xml:space="preserve">: </w:t>
       </w:r>
       <w:hyperlink r:id="rId25" w:tgtFrame="_new" w:history="1">
         <w:r>
@@ -5132,7 +4983,6 @@
         </w:rPr>
       </w:pPr>
       <w:proofErr w:type="spellStart"/>
-      <w:proofErr w:type="gramStart"/>
       <w:r>
         <w:rPr>
           <w:rFonts w:ascii="Times New Roman" w:hAnsi="Times New Roman" w:cs="Times New Roman"/>
@@ -5154,7 +5004,6 @@
         </w:rPr>
         <w:t>:</w:t>
       </w:r>
-      <w:proofErr w:type="gramEnd"/>
     </w:p>
     <w:p>
       <w:pPr>
@@ -5252,7 +5101,6 @@
         </w:rPr>
       </w:pPr>
       <w:proofErr w:type="spellStart"/>
-      <w:proofErr w:type="gramStart"/>
       <w:r>
         <w:rPr>
           <w:rFonts w:ascii="Times New Roman" w:hAnsi="Times New Roman" w:cs="Times New Roman"/>
@@ -5262,7 +5110,6 @@
         <w:t>структурированный</w:t>
       </w:r>
       <w:proofErr w:type="spellEnd"/>
-      <w:proofErr w:type="gramEnd"/>
       <w:r>
         <w:rPr>
           <w:rFonts w:ascii="Times New Roman" w:hAnsi="Times New Roman" w:cs="Times New Roman"/>
@@ -5446,7 +5293,6 @@
         </w:rPr>
       </w:pPr>
       <w:proofErr w:type="spellStart"/>
-      <w:proofErr w:type="gramStart"/>
       <w:r>
         <w:rPr>
           <w:rFonts w:ascii="Times New Roman" w:hAnsi="Times New Roman" w:cs="Times New Roman"/>
@@ -5456,7 +5302,6 @@
         <w:t>загрузка</w:t>
       </w:r>
       <w:proofErr w:type="spellEnd"/>
-      <w:proofErr w:type="gramEnd"/>
       <w:r>
         <w:rPr>
           <w:rFonts w:ascii="Times New Roman" w:hAnsi="Times New Roman" w:cs="Times New Roman"/>
@@ -5479,7 +5324,6 @@
         </w:rPr>
       </w:pPr>
       <w:proofErr w:type="spellStart"/>
-      <w:proofErr w:type="gramStart"/>
       <w:r>
         <w:rPr>
           <w:rFonts w:ascii="Times New Roman" w:hAnsi="Times New Roman" w:cs="Times New Roman"/>
@@ -5489,7 +5333,6 @@
         <w:t>предобработка</w:t>
       </w:r>
       <w:proofErr w:type="spellEnd"/>
-      <w:proofErr w:type="gramEnd"/>
       <w:r>
         <w:rPr>
           <w:rFonts w:ascii="Times New Roman" w:hAnsi="Times New Roman" w:cs="Times New Roman"/>
@@ -5522,7 +5365,6 @@
         </w:rPr>
       </w:pPr>
       <w:proofErr w:type="spellStart"/>
-      <w:proofErr w:type="gramStart"/>
       <w:r>
         <w:rPr>
           <w:rFonts w:ascii="Times New Roman" w:hAnsi="Times New Roman" w:cs="Times New Roman"/>
@@ -5532,7 +5374,6 @@
         <w:t>обучение</w:t>
       </w:r>
       <w:proofErr w:type="spellEnd"/>
-      <w:proofErr w:type="gramEnd"/>
       <w:r>
         <w:rPr>
           <w:rFonts w:ascii="Times New Roman" w:hAnsi="Times New Roman" w:cs="Times New Roman"/>
@@ -5583,7 +5424,6 @@
         </w:rPr>
       </w:pPr>
       <w:proofErr w:type="spellStart"/>
-      <w:proofErr w:type="gramStart"/>
       <w:r>
         <w:rPr>
           <w:rFonts w:ascii="Times New Roman" w:hAnsi="Times New Roman" w:cs="Times New Roman"/>
@@ -5593,7 +5433,6 @@
         <w:t>сохранение</w:t>
       </w:r>
       <w:proofErr w:type="spellEnd"/>
-      <w:proofErr w:type="gramEnd"/>
       <w:r>
         <w:rPr>
           <w:rFonts w:ascii="Times New Roman" w:hAnsi="Times New Roman" w:cs="Times New Roman"/>
@@ -5791,7 +5630,6 @@
         </w:rPr>
       </w:pPr>
       <w:proofErr w:type="spellStart"/>
-      <w:proofErr w:type="gramStart"/>
       <w:r>
         <w:rPr>
           <w:rFonts w:ascii="Times New Roman" w:hAnsi="Times New Roman" w:cs="Times New Roman"/>
@@ -5801,7 +5639,6 @@
         <w:t>чтение</w:t>
       </w:r>
       <w:proofErr w:type="spellEnd"/>
-      <w:proofErr w:type="gramEnd"/>
       <w:r>
         <w:rPr>
           <w:rFonts w:ascii="Times New Roman" w:hAnsi="Times New Roman" w:cs="Times New Roman"/>
@@ -5883,23 +5720,13 @@
           <w:szCs w:val="28"/>
         </w:rPr>
       </w:pPr>
-      <w:proofErr w:type="gramStart"/>
-      <w:r>
-        <w:rPr>
-          <w:rFonts w:ascii="Times New Roman" w:hAnsi="Times New Roman" w:cs="Times New Roman"/>
-          <w:sz w:val="28"/>
-          <w:szCs w:val="28"/>
-        </w:rPr>
-        <w:t>topic</w:t>
-      </w:r>
-      <w:proofErr w:type="gramEnd"/>
-      <w:r>
-        <w:rPr>
-          <w:rFonts w:ascii="Times New Roman" w:hAnsi="Times New Roman" w:cs="Times New Roman"/>
-          <w:sz w:val="28"/>
-          <w:szCs w:val="28"/>
-        </w:rPr>
-        <w:t xml:space="preserve"> </w:t>
+      <w:r>
+        <w:rPr>
+          <w:rFonts w:ascii="Times New Roman" w:hAnsi="Times New Roman" w:cs="Times New Roman"/>
+          <w:sz w:val="28"/>
+          <w:szCs w:val="28"/>
+        </w:rPr>
+        <w:t xml:space="preserve">topic </w:t>
       </w:r>
       <w:proofErr w:type="spellStart"/>
       <w:r>
@@ -6119,7 +5946,6 @@
         </w:rPr>
       </w:pPr>
       <w:proofErr w:type="spellStart"/>
-      <w:proofErr w:type="gramStart"/>
       <w:r>
         <w:rPr>
           <w:rFonts w:ascii="Times New Roman" w:hAnsi="Times New Roman" w:cs="Times New Roman"/>
@@ -6129,7 +5955,6 @@
         <w:t>запись</w:t>
       </w:r>
       <w:proofErr w:type="spellEnd"/>
-      <w:proofErr w:type="gramEnd"/>
       <w:r>
         <w:rPr>
           <w:rFonts w:ascii="Times New Roman" w:hAnsi="Times New Roman" w:cs="Times New Roman"/>
@@ -6204,7 +6029,6 @@
         </w:rPr>
       </w:pPr>
       <w:proofErr w:type="spellStart"/>
-      <w:proofErr w:type="gramStart"/>
       <w:r>
         <w:rPr>
           <w:rFonts w:ascii="Times New Roman" w:hAnsi="Times New Roman" w:cs="Times New Roman"/>
@@ -6214,7 +6038,6 @@
         <w:t>агрегаты</w:t>
       </w:r>
       <w:proofErr w:type="spellEnd"/>
-      <w:proofErr w:type="gramEnd"/>
       <w:r>
         <w:rPr>
           <w:rFonts w:ascii="Times New Roman" w:hAnsi="Times New Roman" w:cs="Times New Roman"/>
@@ -6247,7 +6070,6 @@
         </w:rPr>
       </w:pPr>
       <w:proofErr w:type="spellStart"/>
-      <w:proofErr w:type="gramStart"/>
       <w:r>
         <w:rPr>
           <w:rFonts w:ascii="Times New Roman" w:hAnsi="Times New Roman" w:cs="Times New Roman"/>
@@ -6257,7 +6079,6 @@
         <w:t>временные</w:t>
       </w:r>
       <w:proofErr w:type="spellEnd"/>
-      <w:proofErr w:type="gramEnd"/>
       <w:r>
         <w:rPr>
           <w:rFonts w:ascii="Times New Roman" w:hAnsi="Times New Roman" w:cs="Times New Roman"/>
@@ -6417,7 +6238,6 @@
         </w:rPr>
       </w:pPr>
       <w:proofErr w:type="spellStart"/>
-      <w:proofErr w:type="gramStart"/>
       <w:r>
         <w:rPr>
           <w:rFonts w:ascii="Times New Roman" w:hAnsi="Times New Roman" w:cs="Times New Roman"/>
@@ -6427,7 +6247,6 @@
         <w:t>точность</w:t>
       </w:r>
       <w:proofErr w:type="spellEnd"/>
-      <w:proofErr w:type="gramEnd"/>
       <w:r>
         <w:rPr>
           <w:rFonts w:ascii="Times New Roman" w:hAnsi="Times New Roman" w:cs="Times New Roman"/>
@@ -6460,7 +6279,6 @@
         </w:rPr>
       </w:pPr>
       <w:proofErr w:type="spellStart"/>
-      <w:proofErr w:type="gramStart"/>
       <w:r>
         <w:rPr>
           <w:rFonts w:ascii="Times New Roman" w:hAnsi="Times New Roman" w:cs="Times New Roman"/>
@@ -6470,7 +6288,6 @@
         <w:t>latency</w:t>
       </w:r>
       <w:proofErr w:type="spellEnd"/>
-      <w:proofErr w:type="gramEnd"/>
       <w:r>
         <w:rPr>
           <w:rFonts w:ascii="Times New Roman" w:hAnsi="Times New Roman" w:cs="Times New Roman"/>
@@ -6511,7 +6328,6 @@
         </w:rPr>
       </w:pPr>
       <w:proofErr w:type="spellStart"/>
-      <w:proofErr w:type="gramStart"/>
       <w:r>
         <w:rPr>
           <w:rFonts w:ascii="Times New Roman" w:hAnsi="Times New Roman" w:cs="Times New Roman"/>
@@ -6521,7 +6337,6 @@
         <w:t>throughput</w:t>
       </w:r>
       <w:proofErr w:type="spellEnd"/>
-      <w:proofErr w:type="gramEnd"/>
       <w:r>
         <w:rPr>
           <w:rFonts w:ascii="Times New Roman" w:hAnsi="Times New Roman" w:cs="Times New Roman"/>
@@ -6562,7 +6377,6 @@
         </w:rPr>
       </w:pPr>
       <w:proofErr w:type="spellStart"/>
-      <w:proofErr w:type="gramStart"/>
       <w:r>
         <w:rPr>
           <w:rFonts w:ascii="Times New Roman" w:hAnsi="Times New Roman" w:cs="Times New Roman"/>
@@ -6572,7 +6386,6 @@
         <w:t>масштабируемость</w:t>
       </w:r>
       <w:proofErr w:type="spellEnd"/>
-      <w:proofErr w:type="gramEnd"/>
       <w:r>
         <w:rPr>
           <w:rFonts w:ascii="Times New Roman" w:hAnsi="Times New Roman" w:cs="Times New Roman"/>
@@ -6789,7 +6602,6 @@
         </w:rPr>
       </w:pPr>
       <w:proofErr w:type="spellStart"/>
-      <w:proofErr w:type="gramStart"/>
       <w:r>
         <w:rPr>
           <w:rFonts w:ascii="Times New Roman" w:hAnsi="Times New Roman" w:cs="Times New Roman"/>
@@ -6799,7 +6611,6 @@
         <w:t>присутствует</w:t>
       </w:r>
       <w:proofErr w:type="spellEnd"/>
-      <w:proofErr w:type="gramEnd"/>
       <w:r>
         <w:rPr>
           <w:rFonts w:ascii="Times New Roman" w:hAnsi="Times New Roman" w:cs="Times New Roman"/>
@@ -6827,7 +6638,6 @@
         <w:t xml:space="preserve"> и </w:t>
       </w:r>
       <w:proofErr w:type="spellStart"/>
-      <w:proofErr w:type="gramStart"/>
       <w:r>
         <w:rPr>
           <w:rFonts w:ascii="Times New Roman" w:hAnsi="Times New Roman" w:cs="Times New Roman"/>
@@ -6845,7 +6655,6 @@
         </w:rPr>
         <w:t>;</w:t>
       </w:r>
-      <w:proofErr w:type="gramEnd"/>
     </w:p>
     <w:p>
       <w:pPr>
@@ -6860,7 +6669,6 @@
         </w:rPr>
       </w:pPr>
       <w:proofErr w:type="spellStart"/>
-      <w:proofErr w:type="gramStart"/>
       <w:r>
         <w:rPr>
           <w:rFonts w:ascii="Times New Roman" w:hAnsi="Times New Roman" w:cs="Times New Roman"/>
@@ -6870,7 +6678,6 @@
         <w:t>представлены</w:t>
       </w:r>
       <w:proofErr w:type="spellEnd"/>
-      <w:proofErr w:type="gramEnd"/>
       <w:r>
         <w:rPr>
           <w:rFonts w:ascii="Times New Roman" w:hAnsi="Times New Roman" w:cs="Times New Roman"/>
@@ -7126,7 +6933,7 @@
           <w:szCs w:val="28"/>
         </w:rPr>
         <w:pict w14:anchorId="5EEFB0A2">
-          <v:rect id="_x0000_i1039" style="width:0;height:1.5pt" o:hralign="center" o:hrstd="t" o:hr="t" fillcolor="#a0a0a0" stroked="f"/>
+          <v:rect id="_x0000_i1037" style="width:0;height:1.5pt" o:hralign="center" o:hrstd="t" o:hr="t" fillcolor="#a0a0a0" stroked="f"/>
         </w:pict>
       </w:r>
     </w:p>
@@ -7403,7 +7210,7 @@
           <w:szCs w:val="28"/>
         </w:rPr>
         <w:pict w14:anchorId="2C58108B">
-          <v:rect id="_x0000_i1040" style="width:0;height:1.5pt" o:hralign="center" o:hrstd="t" o:hr="t" fillcolor="#a0a0a0" stroked="f"/>
+          <v:rect id="_x0000_i1038" style="width:0;height:1.5pt" o:hralign="center" o:hrstd="t" o:hr="t" fillcolor="#a0a0a0" stroked="f"/>
         </w:pict>
       </w:r>
     </w:p>
@@ -7512,18 +7319,8 @@
           <w:sz w:val="28"/>
           <w:szCs w:val="28"/>
         </w:rPr>
-        <w:t>Video files (MP4, AVI</w:t>
-      </w:r>
-      <w:proofErr w:type="gramStart"/>
-      <w:r>
-        <w:rPr>
-          <w:rFonts w:ascii="Times New Roman" w:hAnsi="Times New Roman" w:cs="Times New Roman"/>
-          <w:sz w:val="28"/>
-          <w:szCs w:val="28"/>
-        </w:rPr>
-        <w:t>);</w:t>
-      </w:r>
-      <w:proofErr w:type="gramEnd"/>
+        <w:t>Video files (MP4, AVI);</w:t>
+      </w:r>
     </w:p>
     <w:p>
       <w:pPr>
@@ -7646,7 +7443,6 @@
           <w:szCs w:val="28"/>
         </w:rPr>
       </w:pPr>
-      <w:proofErr w:type="gramStart"/>
       <w:r>
         <w:rPr>
           <w:rFonts w:ascii="Times New Roman" w:hAnsi="Times New Roman" w:cs="Times New Roman"/>
@@ -7655,7 +7451,6 @@
         </w:rPr>
         <w:t>timestamp;</w:t>
       </w:r>
-      <w:proofErr w:type="gramEnd"/>
     </w:p>
     <w:p>
       <w:pPr>
@@ -7669,34 +7464,14 @@
           <w:szCs w:val="28"/>
         </w:rPr>
       </w:pPr>
-      <w:proofErr w:type="gramStart"/>
-      <w:r>
-        <w:rPr>
-          <w:rFonts w:ascii="Times New Roman" w:hAnsi="Times New Roman" w:cs="Times New Roman"/>
-          <w:sz w:val="28"/>
-          <w:szCs w:val="28"/>
-        </w:rPr>
-        <w:t>source</w:t>
-      </w:r>
-      <w:proofErr w:type="gramEnd"/>
-      <w:r>
-        <w:rPr>
-          <w:rFonts w:ascii="Times New Roman" w:hAnsi="Times New Roman" w:cs="Times New Roman"/>
-          <w:sz w:val="28"/>
-          <w:szCs w:val="28"/>
-        </w:rPr>
-        <w:t xml:space="preserve"> identifier (camera ID</w:t>
-      </w:r>
-      <w:proofErr w:type="gramStart"/>
-      <w:r>
-        <w:rPr>
-          <w:rFonts w:ascii="Times New Roman" w:hAnsi="Times New Roman" w:cs="Times New Roman"/>
-          <w:sz w:val="28"/>
-          <w:szCs w:val="28"/>
-        </w:rPr>
-        <w:t>);</w:t>
-      </w:r>
-      <w:proofErr w:type="gramEnd"/>
+      <w:r>
+        <w:rPr>
+          <w:rFonts w:ascii="Times New Roman" w:hAnsi="Times New Roman" w:cs="Times New Roman"/>
+          <w:sz w:val="28"/>
+          <w:szCs w:val="28"/>
+        </w:rPr>
+        <w:t>source identifier (camera ID);</w:t>
+      </w:r>
     </w:p>
     <w:p>
       <w:pPr>
@@ -7711,7 +7486,6 @@
         </w:rPr>
       </w:pPr>
       <w:proofErr w:type="spellStart"/>
-      <w:proofErr w:type="gramStart"/>
       <w:r>
         <w:rPr>
           <w:rFonts w:ascii="Times New Roman" w:hAnsi="Times New Roman" w:cs="Times New Roman"/>
@@ -7721,7 +7495,6 @@
         <w:t>predicted</w:t>
       </w:r>
       <w:proofErr w:type="spellEnd"/>
-      <w:proofErr w:type="gramEnd"/>
       <w:r>
         <w:rPr>
           <w:rFonts w:ascii="Times New Roman" w:hAnsi="Times New Roman" w:cs="Times New Roman"/>
@@ -7731,7 +7504,6 @@
         <w:t xml:space="preserve"> </w:t>
       </w:r>
       <w:proofErr w:type="spellStart"/>
-      <w:proofErr w:type="gramStart"/>
       <w:r>
         <w:rPr>
           <w:rFonts w:ascii="Times New Roman" w:hAnsi="Times New Roman" w:cs="Times New Roman"/>
@@ -7749,7 +7521,6 @@
         </w:rPr>
         <w:t>;</w:t>
       </w:r>
-      <w:proofErr w:type="gramEnd"/>
     </w:p>
     <w:p>
       <w:pPr>
@@ -7763,26 +7534,15 @@
           <w:szCs w:val="28"/>
         </w:rPr>
       </w:pPr>
-      <w:proofErr w:type="gramStart"/>
-      <w:r>
-        <w:rPr>
-          <w:rFonts w:ascii="Times New Roman" w:hAnsi="Times New Roman" w:cs="Times New Roman"/>
-          <w:sz w:val="28"/>
-          <w:szCs w:val="28"/>
-        </w:rPr>
-        <w:t>confidence</w:t>
-      </w:r>
-      <w:proofErr w:type="gramEnd"/>
-      <w:r>
-        <w:rPr>
-          <w:rFonts w:ascii="Times New Roman" w:hAnsi="Times New Roman" w:cs="Times New Roman"/>
-          <w:sz w:val="28"/>
-          <w:szCs w:val="28"/>
-        </w:rPr>
-        <w:t xml:space="preserve"> score / </w:t>
-      </w:r>
-      <w:proofErr w:type="spellStart"/>
-      <w:proofErr w:type="gramStart"/>
+      <w:r>
+        <w:rPr>
+          <w:rFonts w:ascii="Times New Roman" w:hAnsi="Times New Roman" w:cs="Times New Roman"/>
+          <w:sz w:val="28"/>
+          <w:szCs w:val="28"/>
+        </w:rPr>
+        <w:t xml:space="preserve">confidence score / </w:t>
+      </w:r>
+      <w:proofErr w:type="spellStart"/>
       <w:r>
         <w:rPr>
           <w:rFonts w:ascii="Times New Roman" w:hAnsi="Times New Roman" w:cs="Times New Roman"/>
@@ -7800,7 +7560,6 @@
         </w:rPr>
         <w:t>;</w:t>
       </w:r>
-      <w:proofErr w:type="gramEnd"/>
     </w:p>
     <w:p>
       <w:pPr>
@@ -7814,23 +7573,13 @@
           <w:szCs w:val="28"/>
         </w:rPr>
       </w:pPr>
-      <w:proofErr w:type="gramStart"/>
-      <w:r>
-        <w:rPr>
-          <w:rFonts w:ascii="Times New Roman" w:hAnsi="Times New Roman" w:cs="Times New Roman"/>
-          <w:sz w:val="28"/>
-          <w:szCs w:val="28"/>
-        </w:rPr>
-        <w:t>face</w:t>
-      </w:r>
-      <w:proofErr w:type="gramEnd"/>
-      <w:r>
-        <w:rPr>
-          <w:rFonts w:ascii="Times New Roman" w:hAnsi="Times New Roman" w:cs="Times New Roman"/>
-          <w:sz w:val="28"/>
-          <w:szCs w:val="28"/>
-        </w:rPr>
-        <w:t xml:space="preserve"> </w:t>
+      <w:r>
+        <w:rPr>
+          <w:rFonts w:ascii="Times New Roman" w:hAnsi="Times New Roman" w:cs="Times New Roman"/>
+          <w:sz w:val="28"/>
+          <w:szCs w:val="28"/>
+        </w:rPr>
+        <w:t xml:space="preserve">face </w:t>
       </w:r>
       <w:proofErr w:type="spellStart"/>
       <w:r>
@@ -7851,7 +7600,6 @@
         <w:t xml:space="preserve"> box </w:t>
       </w:r>
       <w:proofErr w:type="spellStart"/>
-      <w:proofErr w:type="gramStart"/>
       <w:r>
         <w:rPr>
           <w:rFonts w:ascii="Times New Roman" w:hAnsi="Times New Roman" w:cs="Times New Roman"/>
@@ -7869,7 +7617,6 @@
         </w:rPr>
         <w:t>;</w:t>
       </w:r>
-      <w:proofErr w:type="gramEnd"/>
     </w:p>
     <w:p>
       <w:pPr>
@@ -7884,7 +7631,6 @@
         </w:rPr>
       </w:pPr>
       <w:proofErr w:type="spellStart"/>
-      <w:proofErr w:type="gramStart"/>
       <w:r>
         <w:rPr>
           <w:rFonts w:ascii="Times New Roman" w:hAnsi="Times New Roman" w:cs="Times New Roman"/>
@@ -7894,7 +7640,6 @@
         <w:t>optional</w:t>
       </w:r>
       <w:proofErr w:type="spellEnd"/>
-      <w:proofErr w:type="gramEnd"/>
       <w:r>
         <w:rPr>
           <w:rFonts w:ascii="Times New Roman" w:hAnsi="Times New Roman" w:cs="Times New Roman"/>
@@ -8049,7 +7794,7 @@
           <w:szCs w:val="28"/>
         </w:rPr>
         <w:pict w14:anchorId="497F683B">
-          <v:rect id="_x0000_i1041" style="width:0;height:1.5pt" o:hralign="center" o:hrstd="t" o:hr="t" fillcolor="#a0a0a0" stroked="f"/>
+          <v:rect id="_x0000_i1039" style="width:0;height:1.5pt" o:hralign="center" o:hrstd="t" o:hr="t" fillcolor="#a0a0a0" stroked="f"/>
         </w:pict>
       </w:r>
     </w:p>
@@ -8334,7 +8079,6 @@
         <w:t>optional</w:t>
       </w:r>
       <w:proofErr w:type="spellEnd"/>
-      <w:proofErr w:type="gramStart"/>
       <w:r>
         <w:rPr>
           <w:rFonts w:ascii="Times New Roman" w:hAnsi="Times New Roman" w:cs="Times New Roman"/>
@@ -8343,7 +8087,6 @@
         </w:rPr>
         <w:t>);</w:t>
       </w:r>
-      <w:proofErr w:type="gramEnd"/>
     </w:p>
     <w:p>
       <w:pPr>
@@ -8540,7 +8283,7 @@
           <w:szCs w:val="28"/>
         </w:rPr>
         <w:pict w14:anchorId="37CE8111">
-          <v:rect id="_x0000_i1042" style="width:0;height:1.5pt" o:hralign="center" o:hrstd="t" o:hr="t" fillcolor="#a0a0a0" stroked="f"/>
+          <v:rect id="_x0000_i1040" style="width:0;height:1.5pt" o:hralign="center" o:hrstd="t" o:hr="t" fillcolor="#a0a0a0" stroked="f"/>
         </w:pict>
       </w:r>
     </w:p>
@@ -8623,23 +8366,13 @@
           <w:szCs w:val="28"/>
         </w:rPr>
       </w:pPr>
-      <w:proofErr w:type="gramStart"/>
-      <w:r>
-        <w:rPr>
-          <w:rFonts w:ascii="Times New Roman" w:hAnsi="Times New Roman" w:cs="Times New Roman"/>
-          <w:sz w:val="28"/>
-          <w:szCs w:val="28"/>
-        </w:rPr>
-        <w:t>Source:</w:t>
-      </w:r>
-      <w:proofErr w:type="gramEnd"/>
-      <w:r>
-        <w:rPr>
-          <w:rFonts w:ascii="Times New Roman" w:hAnsi="Times New Roman" w:cs="Times New Roman"/>
-          <w:sz w:val="28"/>
-          <w:szCs w:val="28"/>
-        </w:rPr>
-        <w:t xml:space="preserve"> </w:t>
+      <w:r>
+        <w:rPr>
+          <w:rFonts w:ascii="Times New Roman" w:hAnsi="Times New Roman" w:cs="Times New Roman"/>
+          <w:sz w:val="28"/>
+          <w:szCs w:val="28"/>
+        </w:rPr>
+        <w:t xml:space="preserve">Source: </w:t>
       </w:r>
       <w:hyperlink r:id="rId29" w:tgtFrame="_new" w:history="1">
         <w:r>
@@ -8732,23 +8465,13 @@
           <w:szCs w:val="28"/>
         </w:rPr>
       </w:pPr>
-      <w:proofErr w:type="gramStart"/>
-      <w:r>
-        <w:rPr>
-          <w:rFonts w:ascii="Times New Roman" w:hAnsi="Times New Roman" w:cs="Times New Roman"/>
-          <w:sz w:val="28"/>
-          <w:szCs w:val="28"/>
-        </w:rPr>
-        <w:t>Source:</w:t>
-      </w:r>
-      <w:proofErr w:type="gramEnd"/>
-      <w:r>
-        <w:rPr>
-          <w:rFonts w:ascii="Times New Roman" w:hAnsi="Times New Roman" w:cs="Times New Roman"/>
-          <w:sz w:val="28"/>
-          <w:szCs w:val="28"/>
-        </w:rPr>
-        <w:t xml:space="preserve"> </w:t>
+      <w:r>
+        <w:rPr>
+          <w:rFonts w:ascii="Times New Roman" w:hAnsi="Times New Roman" w:cs="Times New Roman"/>
+          <w:sz w:val="28"/>
+          <w:szCs w:val="28"/>
+        </w:rPr>
+        <w:t xml:space="preserve">Source: </w:t>
       </w:r>
       <w:hyperlink r:id="rId30" w:tgtFrame="_new" w:history="1">
         <w:r>
@@ -8883,23 +8606,13 @@
           <w:szCs w:val="28"/>
         </w:rPr>
       </w:pPr>
-      <w:proofErr w:type="gramStart"/>
-      <w:r>
-        <w:rPr>
-          <w:rFonts w:ascii="Times New Roman" w:hAnsi="Times New Roman" w:cs="Times New Roman"/>
-          <w:sz w:val="28"/>
-          <w:szCs w:val="28"/>
-        </w:rPr>
-        <w:t>Source:</w:t>
-      </w:r>
-      <w:proofErr w:type="gramEnd"/>
-      <w:r>
-        <w:rPr>
-          <w:rFonts w:ascii="Times New Roman" w:hAnsi="Times New Roman" w:cs="Times New Roman"/>
-          <w:sz w:val="28"/>
-          <w:szCs w:val="28"/>
-        </w:rPr>
-        <w:t xml:space="preserve"> </w:t>
+      <w:r>
+        <w:rPr>
+          <w:rFonts w:ascii="Times New Roman" w:hAnsi="Times New Roman" w:cs="Times New Roman"/>
+          <w:sz w:val="28"/>
+          <w:szCs w:val="28"/>
+        </w:rPr>
+        <w:t xml:space="preserve">Source: </w:t>
       </w:r>
       <w:hyperlink r:id="rId31" w:tgtFrame="_new" w:history="1">
         <w:r>
@@ -9009,25 +8722,7 @@
           <w:sz w:val="28"/>
           <w:szCs w:val="28"/>
         </w:rPr>
-        <w:t xml:space="preserve">Phase </w:t>
-      </w:r>
-      <w:proofErr w:type="gramStart"/>
-      <w:r>
-        <w:rPr>
-          <w:rFonts w:ascii="Times New Roman" w:hAnsi="Times New Roman" w:cs="Times New Roman"/>
-          <w:sz w:val="28"/>
-          <w:szCs w:val="28"/>
-        </w:rPr>
-        <w:t>1:</w:t>
-      </w:r>
-      <w:proofErr w:type="gramEnd"/>
-      <w:r>
-        <w:rPr>
-          <w:rFonts w:ascii="Times New Roman" w:hAnsi="Times New Roman" w:cs="Times New Roman"/>
-          <w:sz w:val="28"/>
-          <w:szCs w:val="28"/>
-        </w:rPr>
-        <w:t xml:space="preserve"> FER-2013 (</w:t>
+        <w:t>Phase 1: FER-2013 (</w:t>
       </w:r>
       <w:proofErr w:type="spellStart"/>
       <w:r>
@@ -9045,18 +8740,8 @@
           <w:sz w:val="28"/>
           <w:szCs w:val="28"/>
         </w:rPr>
-        <w:t xml:space="preserve"> model</w:t>
-      </w:r>
-      <w:proofErr w:type="gramStart"/>
-      <w:r>
-        <w:rPr>
-          <w:rFonts w:ascii="Times New Roman" w:hAnsi="Times New Roman" w:cs="Times New Roman"/>
-          <w:sz w:val="28"/>
-          <w:szCs w:val="28"/>
-        </w:rPr>
-        <w:t>);</w:t>
-      </w:r>
-      <w:proofErr w:type="gramEnd"/>
+        <w:t xml:space="preserve"> model);</w:t>
+      </w:r>
     </w:p>
     <w:p>
       <w:pPr>
@@ -9130,7 +8815,7 @@
           <w:szCs w:val="28"/>
         </w:rPr>
         <w:pict w14:anchorId="083A36A8">
-          <v:rect id="_x0000_i1043" style="width:0;height:1.5pt" o:hralign="center" o:hrstd="t" o:hr="t" fillcolor="#a0a0a0" stroked="f"/>
+          <v:rect id="_x0000_i1041" style="width:0;height:1.5pt" o:hralign="center" o:hrstd="t" o:hr="t" fillcolor="#a0a0a0" stroked="f"/>
         </w:pict>
       </w:r>
     </w:p>
@@ -9193,7 +8878,6 @@
         </w:rPr>
       </w:pPr>
       <w:proofErr w:type="spellStart"/>
-      <w:proofErr w:type="gramStart"/>
       <w:r>
         <w:rPr>
           <w:rFonts w:ascii="Times New Roman" w:hAnsi="Times New Roman" w:cs="Times New Roman"/>
@@ -9209,16 +8893,7 @@
           <w:sz w:val="28"/>
           <w:szCs w:val="28"/>
         </w:rPr>
-        <w:t>:</w:t>
-      </w:r>
-      <w:proofErr w:type="gramEnd"/>
-      <w:r>
-        <w:rPr>
-          <w:rFonts w:ascii="Times New Roman" w:hAnsi="Times New Roman" w:cs="Times New Roman"/>
-          <w:sz w:val="28"/>
-          <w:szCs w:val="28"/>
-        </w:rPr>
-        <w:t xml:space="preserve"> </w:t>
+        <w:t xml:space="preserve">: </w:t>
       </w:r>
       <w:hyperlink r:id="rId32" w:tgtFrame="_new" w:history="1">
         <w:r>
@@ -9291,7 +8966,6 @@
         </w:rPr>
       </w:pPr>
       <w:proofErr w:type="spellStart"/>
-      <w:proofErr w:type="gramStart"/>
       <w:r>
         <w:rPr>
           <w:rFonts w:ascii="Times New Roman" w:hAnsi="Times New Roman" w:cs="Times New Roman"/>
@@ -9307,16 +8981,7 @@
           <w:sz w:val="28"/>
           <w:szCs w:val="28"/>
         </w:rPr>
-        <w:t>:</w:t>
-      </w:r>
-      <w:proofErr w:type="gramEnd"/>
-      <w:r>
-        <w:rPr>
-          <w:rFonts w:ascii="Times New Roman" w:hAnsi="Times New Roman" w:cs="Times New Roman"/>
-          <w:sz w:val="28"/>
-          <w:szCs w:val="28"/>
-        </w:rPr>
-        <w:t xml:space="preserve"> </w:t>
+        <w:t xml:space="preserve">: </w:t>
       </w:r>
       <w:hyperlink r:id="rId34" w:tgtFrame="_new" w:history="1">
         <w:r>
@@ -9442,7 +9107,6 @@
         </w:rPr>
       </w:pPr>
       <w:proofErr w:type="spellStart"/>
-      <w:proofErr w:type="gramStart"/>
       <w:r>
         <w:rPr>
           <w:rFonts w:ascii="Times New Roman" w:hAnsi="Times New Roman" w:cs="Times New Roman"/>
@@ -9452,7 +9116,6 @@
         <w:t>torchvision</w:t>
       </w:r>
       <w:proofErr w:type="spellEnd"/>
-      <w:proofErr w:type="gramEnd"/>
       <w:r>
         <w:rPr>
           <w:rFonts w:ascii="Times New Roman" w:hAnsi="Times New Roman" w:cs="Times New Roman"/>
@@ -9462,7 +9125,6 @@
         <w:t xml:space="preserve">, </w:t>
       </w:r>
       <w:proofErr w:type="spellStart"/>
-      <w:proofErr w:type="gramStart"/>
       <w:r>
         <w:rPr>
           <w:rFonts w:ascii="Times New Roman" w:hAnsi="Times New Roman" w:cs="Times New Roman"/>
@@ -9478,16 +9140,7 @@
           <w:sz w:val="28"/>
           <w:szCs w:val="28"/>
         </w:rPr>
-        <w:t>:</w:t>
-      </w:r>
-      <w:proofErr w:type="gramEnd"/>
-      <w:r>
-        <w:rPr>
-          <w:rFonts w:ascii="Times New Roman" w:hAnsi="Times New Roman" w:cs="Times New Roman"/>
-          <w:sz w:val="28"/>
-          <w:szCs w:val="28"/>
-        </w:rPr>
-        <w:t xml:space="preserve"> </w:t>
+        <w:t xml:space="preserve">: </w:t>
       </w:r>
       <w:hyperlink r:id="rId36" w:tgtFrame="_new" w:history="1">
         <w:r>
@@ -9514,7 +9167,6 @@
         </w:rPr>
       </w:pPr>
       <w:proofErr w:type="spellStart"/>
-      <w:proofErr w:type="gramStart"/>
       <w:r>
         <w:rPr>
           <w:rFonts w:ascii="Times New Roman" w:hAnsi="Times New Roman" w:cs="Times New Roman"/>
@@ -9530,16 +9182,7 @@
           <w:sz w:val="28"/>
           <w:szCs w:val="28"/>
         </w:rPr>
-        <w:t>:</w:t>
-      </w:r>
-      <w:proofErr w:type="gramEnd"/>
-      <w:r>
-        <w:rPr>
-          <w:rFonts w:ascii="Times New Roman" w:hAnsi="Times New Roman" w:cs="Times New Roman"/>
-          <w:sz w:val="28"/>
-          <w:szCs w:val="28"/>
-        </w:rPr>
-        <w:t xml:space="preserve"> </w:t>
+        <w:t xml:space="preserve">: </w:t>
       </w:r>
       <w:hyperlink r:id="rId37" w:tgtFrame="_new" w:history="1">
         <w:r>
@@ -9808,25 +9451,7 @@
           <w:sz w:val="28"/>
           <w:szCs w:val="28"/>
         </w:rPr>
-        <w:t xml:space="preserve"> (Parquet</w:t>
-      </w:r>
-      <w:proofErr w:type="gramStart"/>
-      <w:r>
-        <w:rPr>
-          <w:rFonts w:ascii="Times New Roman" w:hAnsi="Times New Roman" w:cs="Times New Roman"/>
-          <w:sz w:val="28"/>
-          <w:szCs w:val="28"/>
-        </w:rPr>
-        <w:t>):</w:t>
-      </w:r>
-      <w:proofErr w:type="gramEnd"/>
-      <w:r>
-        <w:rPr>
-          <w:rFonts w:ascii="Times New Roman" w:hAnsi="Times New Roman" w:cs="Times New Roman"/>
-          <w:sz w:val="28"/>
-          <w:szCs w:val="28"/>
-        </w:rPr>
-        <w:t xml:space="preserve"> </w:t>
+        <w:t xml:space="preserve"> (Parquet): </w:t>
       </w:r>
       <w:hyperlink r:id="rId42" w:tgtFrame="_new" w:history="1">
         <w:r>
@@ -9887,23 +9512,13 @@
           <w:szCs w:val="28"/>
         </w:rPr>
       </w:pPr>
-      <w:proofErr w:type="gramStart"/>
-      <w:r>
-        <w:rPr>
-          <w:rFonts w:ascii="Times New Roman" w:hAnsi="Times New Roman" w:cs="Times New Roman"/>
-          <w:sz w:val="28"/>
-          <w:szCs w:val="28"/>
-        </w:rPr>
-        <w:t>Pandas:</w:t>
-      </w:r>
-      <w:proofErr w:type="gramEnd"/>
-      <w:r>
-        <w:rPr>
-          <w:rFonts w:ascii="Times New Roman" w:hAnsi="Times New Roman" w:cs="Times New Roman"/>
-          <w:sz w:val="28"/>
-          <w:szCs w:val="28"/>
-        </w:rPr>
-        <w:t xml:space="preserve"> </w:t>
+      <w:r>
+        <w:rPr>
+          <w:rFonts w:ascii="Times New Roman" w:hAnsi="Times New Roman" w:cs="Times New Roman"/>
+          <w:sz w:val="28"/>
+          <w:szCs w:val="28"/>
+        </w:rPr>
+        <w:t xml:space="preserve">Pandas: </w:t>
       </w:r>
       <w:hyperlink r:id="rId44" w:tgtFrame="_new" w:history="1">
         <w:r>
@@ -10031,7 +9646,6 @@
         </w:rPr>
       </w:pPr>
       <w:proofErr w:type="spellStart"/>
-      <w:proofErr w:type="gramStart"/>
       <w:r>
         <w:rPr>
           <w:rFonts w:ascii="Times New Roman" w:hAnsi="Times New Roman" w:cs="Times New Roman"/>
@@ -10047,16 +9661,7 @@
           <w:sz w:val="28"/>
           <w:szCs w:val="28"/>
         </w:rPr>
-        <w:t>:</w:t>
-      </w:r>
-      <w:proofErr w:type="gramEnd"/>
-      <w:r>
-        <w:rPr>
-          <w:rFonts w:ascii="Times New Roman" w:hAnsi="Times New Roman" w:cs="Times New Roman"/>
-          <w:sz w:val="28"/>
-          <w:szCs w:val="28"/>
-        </w:rPr>
-        <w:t xml:space="preserve"> </w:t>
+        <w:t xml:space="preserve">: </w:t>
       </w:r>
       <w:hyperlink r:id="rId46" w:tgtFrame="_new" w:history="1">
         <w:r>
@@ -10083,7 +9688,6 @@
         </w:rPr>
       </w:pPr>
       <w:proofErr w:type="spellStart"/>
-      <w:proofErr w:type="gramStart"/>
       <w:r>
         <w:rPr>
           <w:rFonts w:ascii="Times New Roman" w:hAnsi="Times New Roman" w:cs="Times New Roman"/>
@@ -10099,16 +9703,7 @@
           <w:sz w:val="28"/>
           <w:szCs w:val="28"/>
         </w:rPr>
-        <w:t>:</w:t>
-      </w:r>
-      <w:proofErr w:type="gramEnd"/>
-      <w:r>
-        <w:rPr>
-          <w:rFonts w:ascii="Times New Roman" w:hAnsi="Times New Roman" w:cs="Times New Roman"/>
-          <w:sz w:val="28"/>
-          <w:szCs w:val="28"/>
-        </w:rPr>
-        <w:t xml:space="preserve"> </w:t>
+        <w:t xml:space="preserve">: </w:t>
       </w:r>
       <w:hyperlink r:id="rId47" w:tgtFrame="_new" w:history="1">
         <w:r>
@@ -10135,7 +9730,6 @@
         </w:rPr>
       </w:pPr>
       <w:proofErr w:type="spellStart"/>
-      <w:proofErr w:type="gramStart"/>
       <w:r>
         <w:rPr>
           <w:rFonts w:ascii="Times New Roman" w:hAnsi="Times New Roman" w:cs="Times New Roman"/>
@@ -10151,16 +9745,7 @@
           <w:sz w:val="28"/>
           <w:szCs w:val="28"/>
         </w:rPr>
-        <w:t>:</w:t>
-      </w:r>
-      <w:proofErr w:type="gramEnd"/>
-      <w:r>
-        <w:rPr>
-          <w:rFonts w:ascii="Times New Roman" w:hAnsi="Times New Roman" w:cs="Times New Roman"/>
-          <w:sz w:val="28"/>
-          <w:szCs w:val="28"/>
-        </w:rPr>
-        <w:t xml:space="preserve"> </w:t>
+        <w:t xml:space="preserve">: </w:t>
       </w:r>
       <w:hyperlink r:id="rId48" w:tgtFrame="_new" w:history="1">
         <w:r>
@@ -10292,7 +9877,7 @@
           <w:szCs w:val="28"/>
         </w:rPr>
         <w:pict w14:anchorId="3C4F7777">
-          <v:rect id="_x0000_i1044" style="width:0;height:1.5pt" o:hralign="center" o:hrstd="t" o:hr="t" fillcolor="#a0a0a0" stroked="f"/>
+          <v:rect id="_x0000_i1042" style="width:0;height:1.5pt" o:hralign="center" o:hrstd="t" o:hr="t" fillcolor="#a0a0a0" stroked="f"/>
         </w:pict>
       </w:r>
     </w:p>
@@ -10418,7 +10003,6 @@
         </w:rPr>
       </w:pPr>
       <w:proofErr w:type="spellStart"/>
-      <w:proofErr w:type="gramStart"/>
       <w:r>
         <w:rPr>
           <w:rFonts w:ascii="Times New Roman" w:hAnsi="Times New Roman" w:cs="Times New Roman"/>
@@ -10428,25 +10012,14 @@
         <w:t>dependency</w:t>
       </w:r>
       <w:proofErr w:type="spellEnd"/>
-      <w:proofErr w:type="gramEnd"/>
-      <w:r>
-        <w:rPr>
-          <w:rFonts w:ascii="Times New Roman" w:hAnsi="Times New Roman" w:cs="Times New Roman"/>
-          <w:sz w:val="28"/>
-          <w:szCs w:val="28"/>
-        </w:rPr>
-        <w:t xml:space="preserve"> management (requirements.txt</w:t>
-      </w:r>
-      <w:proofErr w:type="gramStart"/>
-      <w:r>
-        <w:rPr>
-          <w:rFonts w:ascii="Times New Roman" w:hAnsi="Times New Roman" w:cs="Times New Roman"/>
-          <w:sz w:val="28"/>
-          <w:szCs w:val="28"/>
-        </w:rPr>
-        <w:t>);</w:t>
-      </w:r>
-      <w:proofErr w:type="gramEnd"/>
+      <w:r>
+        <w:rPr>
+          <w:rFonts w:ascii="Times New Roman" w:hAnsi="Times New Roman" w:cs="Times New Roman"/>
+          <w:sz w:val="28"/>
+          <w:szCs w:val="28"/>
+        </w:rPr>
+        <w:t xml:space="preserve"> management (requirements.txt);</w:t>
+      </w:r>
     </w:p>
     <w:p>
       <w:pPr>
@@ -10461,7 +10034,6 @@
         </w:rPr>
       </w:pPr>
       <w:proofErr w:type="spellStart"/>
-      <w:proofErr w:type="gramStart"/>
       <w:r>
         <w:rPr>
           <w:rFonts w:ascii="Times New Roman" w:hAnsi="Times New Roman" w:cs="Times New Roman"/>
@@ -10472,7 +10044,6 @@
         <w:t>structured</w:t>
       </w:r>
       <w:proofErr w:type="spellEnd"/>
-      <w:proofErr w:type="gramEnd"/>
       <w:r>
         <w:rPr>
           <w:rFonts w:ascii="Times New Roman" w:hAnsi="Times New Roman" w:cs="Times New Roman"/>
@@ -10534,7 +10105,6 @@
         </w:rPr>
       </w:pPr>
       <w:proofErr w:type="spellStart"/>
-      <w:proofErr w:type="gramStart"/>
       <w:r>
         <w:rPr>
           <w:rFonts w:ascii="Times New Roman" w:hAnsi="Times New Roman" w:cs="Times New Roman"/>
@@ -10544,25 +10114,14 @@
         <w:t>load</w:t>
       </w:r>
       <w:proofErr w:type="spellEnd"/>
-      <w:proofErr w:type="gramEnd"/>
-      <w:r>
-        <w:rPr>
-          <w:rFonts w:ascii="Times New Roman" w:hAnsi="Times New Roman" w:cs="Times New Roman"/>
-          <w:sz w:val="28"/>
-          <w:szCs w:val="28"/>
-        </w:rPr>
-        <w:t xml:space="preserve"> FER-2013 / RAF-</w:t>
-      </w:r>
-      <w:proofErr w:type="gramStart"/>
-      <w:r>
-        <w:rPr>
-          <w:rFonts w:ascii="Times New Roman" w:hAnsi="Times New Roman" w:cs="Times New Roman"/>
-          <w:sz w:val="28"/>
-          <w:szCs w:val="28"/>
-        </w:rPr>
-        <w:t>DB;</w:t>
-      </w:r>
-      <w:proofErr w:type="gramEnd"/>
+      <w:r>
+        <w:rPr>
+          <w:rFonts w:ascii="Times New Roman" w:hAnsi="Times New Roman" w:cs="Times New Roman"/>
+          <w:sz w:val="28"/>
+          <w:szCs w:val="28"/>
+        </w:rPr>
+        <w:t xml:space="preserve"> FER-2013 / RAF-DB;</w:t>
+      </w:r>
     </w:p>
     <w:p>
       <w:pPr>
@@ -10576,23 +10135,13 @@
           <w:szCs w:val="28"/>
         </w:rPr>
       </w:pPr>
-      <w:proofErr w:type="gramStart"/>
-      <w:r>
-        <w:rPr>
-          <w:rFonts w:ascii="Times New Roman" w:hAnsi="Times New Roman" w:cs="Times New Roman"/>
-          <w:sz w:val="28"/>
-          <w:szCs w:val="28"/>
-        </w:rPr>
-        <w:t>data</w:t>
-      </w:r>
-      <w:proofErr w:type="gramEnd"/>
-      <w:r>
-        <w:rPr>
-          <w:rFonts w:ascii="Times New Roman" w:hAnsi="Times New Roman" w:cs="Times New Roman"/>
-          <w:sz w:val="28"/>
-          <w:szCs w:val="28"/>
-        </w:rPr>
-        <w:t xml:space="preserve"> </w:t>
+      <w:r>
+        <w:rPr>
+          <w:rFonts w:ascii="Times New Roman" w:hAnsi="Times New Roman" w:cs="Times New Roman"/>
+          <w:sz w:val="28"/>
+          <w:szCs w:val="28"/>
+        </w:rPr>
+        <w:t xml:space="preserve">data </w:t>
       </w:r>
       <w:proofErr w:type="spellStart"/>
       <w:r>
@@ -10610,18 +10159,8 @@
           <w:sz w:val="28"/>
           <w:szCs w:val="28"/>
         </w:rPr>
-        <w:t xml:space="preserve"> and </w:t>
-      </w:r>
-      <w:proofErr w:type="gramStart"/>
-      <w:r>
-        <w:rPr>
-          <w:rFonts w:ascii="Times New Roman" w:hAnsi="Times New Roman" w:cs="Times New Roman"/>
-          <w:sz w:val="28"/>
-          <w:szCs w:val="28"/>
-        </w:rPr>
-        <w:t>augmentation;</w:t>
-      </w:r>
-      <w:proofErr w:type="gramEnd"/>
+        <w:t xml:space="preserve"> and augmentation;</w:t>
+      </w:r>
     </w:p>
     <w:p>
       <w:pPr>
@@ -10677,18 +10216,8 @@
           <w:sz w:val="28"/>
           <w:szCs w:val="28"/>
         </w:rPr>
-        <w:t xml:space="preserve"> </w:t>
-      </w:r>
-      <w:proofErr w:type="gramStart"/>
-      <w:r>
-        <w:rPr>
-          <w:rFonts w:ascii="Times New Roman" w:hAnsi="Times New Roman" w:cs="Times New Roman"/>
-          <w:sz w:val="28"/>
-          <w:szCs w:val="28"/>
-        </w:rPr>
-        <w:t>training;</w:t>
-      </w:r>
-      <w:proofErr w:type="gramEnd"/>
+        <w:t xml:space="preserve"> training;</w:t>
+      </w:r>
     </w:p>
     <w:p>
       <w:pPr>
@@ -10702,23 +10231,13 @@
           <w:szCs w:val="28"/>
         </w:rPr>
       </w:pPr>
-      <w:proofErr w:type="gramStart"/>
-      <w:r>
-        <w:rPr>
-          <w:rFonts w:ascii="Times New Roman" w:hAnsi="Times New Roman" w:cs="Times New Roman"/>
-          <w:sz w:val="28"/>
-          <w:szCs w:val="28"/>
-        </w:rPr>
-        <w:t>model</w:t>
-      </w:r>
-      <w:proofErr w:type="gramEnd"/>
-      <w:r>
-        <w:rPr>
-          <w:rFonts w:ascii="Times New Roman" w:hAnsi="Times New Roman" w:cs="Times New Roman"/>
-          <w:sz w:val="28"/>
-          <w:szCs w:val="28"/>
-        </w:rPr>
-        <w:t xml:space="preserve"> export (model.pt).</w:t>
+      <w:r>
+        <w:rPr>
+          <w:rFonts w:ascii="Times New Roman" w:hAnsi="Times New Roman" w:cs="Times New Roman"/>
+          <w:sz w:val="28"/>
+          <w:szCs w:val="28"/>
+        </w:rPr>
+        <w:t>model export (model.pt).</w:t>
       </w:r>
     </w:p>
     <w:p>
@@ -10757,7 +10276,6 @@
         </w:rPr>
       </w:pPr>
       <w:proofErr w:type="spellStart"/>
-      <w:proofErr w:type="gramStart"/>
       <w:r>
         <w:rPr>
           <w:rFonts w:ascii="Times New Roman" w:hAnsi="Times New Roman" w:cs="Times New Roman"/>
@@ -10767,7 +10285,6 @@
         <w:t>video</w:t>
       </w:r>
       <w:proofErr w:type="spellEnd"/>
-      <w:proofErr w:type="gramEnd"/>
       <w:r>
         <w:rPr>
           <w:rFonts w:ascii="Times New Roman" w:hAnsi="Times New Roman" w:cs="Times New Roman"/>
@@ -10777,7 +10294,6 @@
         <w:t xml:space="preserve">/webcam </w:t>
       </w:r>
       <w:proofErr w:type="spellStart"/>
-      <w:proofErr w:type="gramStart"/>
       <w:r>
         <w:rPr>
           <w:rFonts w:ascii="Times New Roman" w:hAnsi="Times New Roman" w:cs="Times New Roman"/>
@@ -10795,7 +10311,6 @@
         </w:rPr>
         <w:t>;</w:t>
       </w:r>
-      <w:proofErr w:type="gramEnd"/>
     </w:p>
     <w:p>
       <w:pPr>
@@ -10809,34 +10324,14 @@
           <w:szCs w:val="28"/>
         </w:rPr>
       </w:pPr>
-      <w:proofErr w:type="gramStart"/>
-      <w:r>
-        <w:rPr>
-          <w:rFonts w:ascii="Times New Roman" w:hAnsi="Times New Roman" w:cs="Times New Roman"/>
-          <w:sz w:val="28"/>
-          <w:szCs w:val="28"/>
-        </w:rPr>
-        <w:t>frame</w:t>
-      </w:r>
-      <w:proofErr w:type="gramEnd"/>
-      <w:r>
-        <w:rPr>
-          <w:rFonts w:ascii="Times New Roman" w:hAnsi="Times New Roman" w:cs="Times New Roman"/>
-          <w:sz w:val="28"/>
-          <w:szCs w:val="28"/>
-        </w:rPr>
-        <w:t xml:space="preserve"> sampling (5–10 FPS</w:t>
-      </w:r>
-      <w:proofErr w:type="gramStart"/>
-      <w:r>
-        <w:rPr>
-          <w:rFonts w:ascii="Times New Roman" w:hAnsi="Times New Roman" w:cs="Times New Roman"/>
-          <w:sz w:val="28"/>
-          <w:szCs w:val="28"/>
-        </w:rPr>
-        <w:t>);</w:t>
-      </w:r>
-      <w:proofErr w:type="gramEnd"/>
+      <w:r>
+        <w:rPr>
+          <w:rFonts w:ascii="Times New Roman" w:hAnsi="Times New Roman" w:cs="Times New Roman"/>
+          <w:sz w:val="28"/>
+          <w:szCs w:val="28"/>
+        </w:rPr>
+        <w:t>frame sampling (5–10 FPS);</w:t>
+      </w:r>
     </w:p>
     <w:p>
       <w:pPr>
@@ -10892,18 +10387,8 @@
           <w:sz w:val="28"/>
           <w:szCs w:val="28"/>
         </w:rPr>
-        <w:t xml:space="preserve"> (producer.py</w:t>
-      </w:r>
-      <w:proofErr w:type="gramStart"/>
-      <w:r>
-        <w:rPr>
-          <w:rFonts w:ascii="Times New Roman" w:hAnsi="Times New Roman" w:cs="Times New Roman"/>
-          <w:sz w:val="28"/>
-          <w:szCs w:val="28"/>
-        </w:rPr>
-        <w:t>);</w:t>
-      </w:r>
-      <w:proofErr w:type="gramEnd"/>
+        <w:t xml:space="preserve"> (producer.py);</w:t>
+      </w:r>
     </w:p>
     <w:p>
       <w:pPr>
@@ -10917,23 +10402,13 @@
           <w:szCs w:val="28"/>
         </w:rPr>
       </w:pPr>
-      <w:proofErr w:type="gramStart"/>
-      <w:r>
-        <w:rPr>
-          <w:rFonts w:ascii="Times New Roman" w:hAnsi="Times New Roman" w:cs="Times New Roman"/>
-          <w:sz w:val="28"/>
-          <w:szCs w:val="28"/>
-        </w:rPr>
-        <w:t>topic:</w:t>
-      </w:r>
-      <w:proofErr w:type="gramEnd"/>
-      <w:r>
-        <w:rPr>
-          <w:rFonts w:ascii="Times New Roman" w:hAnsi="Times New Roman" w:cs="Times New Roman"/>
-          <w:sz w:val="28"/>
-          <w:szCs w:val="28"/>
-        </w:rPr>
-        <w:t xml:space="preserve"> </w:t>
+      <w:r>
+        <w:rPr>
+          <w:rFonts w:ascii="Times New Roman" w:hAnsi="Times New Roman" w:cs="Times New Roman"/>
+          <w:sz w:val="28"/>
+          <w:szCs w:val="28"/>
+        </w:rPr>
+        <w:t xml:space="preserve">topic: </w:t>
       </w:r>
       <w:proofErr w:type="spellStart"/>
       <w:r>
@@ -11045,18 +10520,8 @@
           <w:sz w:val="28"/>
           <w:szCs w:val="28"/>
         </w:rPr>
-        <w:t xml:space="preserve"> Streaming </w:t>
-      </w:r>
-      <w:proofErr w:type="gramStart"/>
-      <w:r>
-        <w:rPr>
-          <w:rFonts w:ascii="Times New Roman" w:hAnsi="Times New Roman" w:cs="Times New Roman"/>
-          <w:sz w:val="28"/>
-          <w:szCs w:val="28"/>
-        </w:rPr>
-        <w:t>consumer;</w:t>
-      </w:r>
-      <w:proofErr w:type="gramEnd"/>
+        <w:t xml:space="preserve"> Streaming consumer;</w:t>
+      </w:r>
     </w:p>
     <w:p>
       <w:pPr>
@@ -11070,23 +10535,13 @@
           <w:szCs w:val="28"/>
         </w:rPr>
       </w:pPr>
-      <w:proofErr w:type="gramStart"/>
-      <w:r>
-        <w:rPr>
-          <w:rFonts w:ascii="Times New Roman" w:hAnsi="Times New Roman" w:cs="Times New Roman"/>
-          <w:sz w:val="28"/>
-          <w:szCs w:val="28"/>
-        </w:rPr>
-        <w:t>face</w:t>
-      </w:r>
-      <w:proofErr w:type="gramEnd"/>
-      <w:r>
-        <w:rPr>
-          <w:rFonts w:ascii="Times New Roman" w:hAnsi="Times New Roman" w:cs="Times New Roman"/>
-          <w:sz w:val="28"/>
-          <w:szCs w:val="28"/>
-        </w:rPr>
-        <w:t xml:space="preserve"> </w:t>
+      <w:r>
+        <w:rPr>
+          <w:rFonts w:ascii="Times New Roman" w:hAnsi="Times New Roman" w:cs="Times New Roman"/>
+          <w:sz w:val="28"/>
+          <w:szCs w:val="28"/>
+        </w:rPr>
+        <w:t xml:space="preserve">face </w:t>
       </w:r>
       <w:proofErr w:type="spellStart"/>
       <w:r>
@@ -11116,7 +10571,6 @@
         <w:t>MediaPipe</w:t>
       </w:r>
       <w:proofErr w:type="spellEnd"/>
-      <w:proofErr w:type="gramStart"/>
       <w:r>
         <w:rPr>
           <w:rFonts w:ascii="Times New Roman" w:hAnsi="Times New Roman" w:cs="Times New Roman"/>
@@ -11125,7 +10579,6 @@
         </w:rPr>
         <w:t>);</w:t>
       </w:r>
-      <w:proofErr w:type="gramEnd"/>
     </w:p>
     <w:p>
       <w:pPr>
@@ -11176,7 +10629,6 @@
         <w:t xml:space="preserve"> </w:t>
       </w:r>
       <w:proofErr w:type="spellStart"/>
-      <w:proofErr w:type="gramStart"/>
       <w:r>
         <w:rPr>
           <w:rFonts w:ascii="Times New Roman" w:hAnsi="Times New Roman" w:cs="Times New Roman"/>
@@ -11194,7 +10646,6 @@
         </w:rPr>
         <w:t>;</w:t>
       </w:r>
-      <w:proofErr w:type="gramEnd"/>
     </w:p>
     <w:p>
       <w:pPr>
@@ -11252,23 +10703,13 @@
           <w:szCs w:val="28"/>
         </w:rPr>
       </w:pPr>
-      <w:proofErr w:type="gramStart"/>
-      <w:r>
-        <w:rPr>
-          <w:rFonts w:ascii="Times New Roman" w:hAnsi="Times New Roman" w:cs="Times New Roman"/>
-          <w:sz w:val="28"/>
-          <w:szCs w:val="28"/>
-        </w:rPr>
-        <w:t>time</w:t>
-      </w:r>
-      <w:proofErr w:type="gramEnd"/>
-      <w:r>
-        <w:rPr>
-          <w:rFonts w:ascii="Times New Roman" w:hAnsi="Times New Roman" w:cs="Times New Roman"/>
-          <w:sz w:val="28"/>
-          <w:szCs w:val="28"/>
-        </w:rPr>
-        <w:t>-</w:t>
+      <w:r>
+        <w:rPr>
+          <w:rFonts w:ascii="Times New Roman" w:hAnsi="Times New Roman" w:cs="Times New Roman"/>
+          <w:sz w:val="28"/>
+          <w:szCs w:val="28"/>
+        </w:rPr>
+        <w:t>time-</w:t>
       </w:r>
       <w:proofErr w:type="spellStart"/>
       <w:r>
@@ -11289,7 +10730,6 @@
         <w:t xml:space="preserve"> </w:t>
       </w:r>
       <w:proofErr w:type="spellStart"/>
-      <w:proofErr w:type="gramStart"/>
       <w:r>
         <w:rPr>
           <w:rFonts w:ascii="Times New Roman" w:hAnsi="Times New Roman" w:cs="Times New Roman"/>
@@ -11307,7 +10747,6 @@
         </w:rPr>
         <w:t>;</w:t>
       </w:r>
-      <w:proofErr w:type="gramEnd"/>
     </w:p>
     <w:p>
       <w:pPr>
@@ -11322,7 +10761,6 @@
         </w:rPr>
       </w:pPr>
       <w:proofErr w:type="spellStart"/>
-      <w:proofErr w:type="gramStart"/>
       <w:r>
         <w:rPr>
           <w:rFonts w:ascii="Times New Roman" w:hAnsi="Times New Roman" w:cs="Times New Roman"/>
@@ -11332,7 +10770,6 @@
         <w:t>emotion</w:t>
       </w:r>
       <w:proofErr w:type="spellEnd"/>
-      <w:proofErr w:type="gramEnd"/>
       <w:r>
         <w:rPr>
           <w:rFonts w:ascii="Times New Roman" w:hAnsi="Times New Roman" w:cs="Times New Roman"/>
@@ -11342,7 +10779,6 @@
         <w:t xml:space="preserve"> distribution </w:t>
       </w:r>
       <w:proofErr w:type="spellStart"/>
-      <w:proofErr w:type="gramStart"/>
       <w:r>
         <w:rPr>
           <w:rFonts w:ascii="Times New Roman" w:hAnsi="Times New Roman" w:cs="Times New Roman"/>
@@ -11360,7 +10796,6 @@
         </w:rPr>
         <w:t>;</w:t>
       </w:r>
-      <w:proofErr w:type="gramEnd"/>
     </w:p>
     <w:p>
       <w:pPr>
@@ -11504,18 +10939,8 @@
           <w:sz w:val="28"/>
           <w:szCs w:val="28"/>
         </w:rPr>
-        <w:t>, macro F1, confusion matrix</w:t>
-      </w:r>
-      <w:proofErr w:type="gramStart"/>
-      <w:r>
-        <w:rPr>
-          <w:rFonts w:ascii="Times New Roman" w:hAnsi="Times New Roman" w:cs="Times New Roman"/>
-          <w:sz w:val="28"/>
-          <w:szCs w:val="28"/>
-        </w:rPr>
-        <w:t>);</w:t>
-      </w:r>
-      <w:proofErr w:type="gramEnd"/>
+        <w:t>, macro F1, confusion matrix);</w:t>
+      </w:r>
     </w:p>
     <w:p>
       <w:pPr>
@@ -11553,7 +10978,6 @@
         </w:rPr>
       </w:pPr>
       <w:proofErr w:type="spellStart"/>
-      <w:proofErr w:type="gramStart"/>
       <w:r>
         <w:rPr>
           <w:rFonts w:ascii="Times New Roman" w:hAnsi="Times New Roman" w:cs="Times New Roman"/>
@@ -11563,7 +10987,6 @@
         <w:t>scalability</w:t>
       </w:r>
       <w:proofErr w:type="spellEnd"/>
-      <w:proofErr w:type="gramEnd"/>
       <w:r>
         <w:rPr>
           <w:rFonts w:ascii="Times New Roman" w:hAnsi="Times New Roman" w:cs="Times New Roman"/>
@@ -11624,7 +11047,7 @@
           <w:szCs w:val="28"/>
         </w:rPr>
         <w:pict w14:anchorId="4FA6DF0E">
-          <v:rect id="_x0000_i1045" style="width:0;height:1.5pt" o:hralign="center" o:hrstd="t" o:hr="t" fillcolor="#a0a0a0" stroked="f"/>
+          <v:rect id="_x0000_i1043" style="width:0;height:1.5pt" o:hralign="center" o:hrstd="t" o:hr="t" fillcolor="#a0a0a0" stroked="f"/>
         </w:pict>
       </w:r>
     </w:p>
@@ -11769,7 +11192,7 @@
           <w:szCs w:val="28"/>
         </w:rPr>
         <w:pict w14:anchorId="4FC7F939">
-          <v:rect id="_x0000_i1046" style="width:0;height:1.5pt" o:hralign="center" o:hrstd="t" o:hr="t" fillcolor="#a0a0a0" stroked="f"/>
+          <v:rect id="_x0000_i1044" style="width:0;height:1.5pt" o:hralign="center" o:hrstd="t" o:hr="t" fillcolor="#a0a0a0" stroked="f"/>
         </w:pict>
       </w:r>
     </w:p>
@@ -12002,6 +11425,484 @@
         </w:rPr>
         <w:t xml:space="preserve">  README.md</w:t>
       </w:r>
+    </w:p>
+    <w:p>
+      <w:pPr>
+        <w:rPr>
+          <w:rFonts w:ascii="Times New Roman" w:hAnsi="Times New Roman" w:cs="Times New Roman"/>
+          <w:sz w:val="28"/>
+          <w:szCs w:val="28"/>
+        </w:rPr>
+      </w:pPr>
+    </w:p>
+    <w:p>
+      <w:pPr>
+        <w:rPr>
+          <w:rFonts w:ascii="Times New Roman" w:hAnsi="Times New Roman" w:cs="Times New Roman"/>
+          <w:sz w:val="28"/>
+          <w:szCs w:val="28"/>
+        </w:rPr>
+      </w:pPr>
+    </w:p>
+    <w:p>
+      <w:pPr>
+        <w:rPr>
+          <w:rFonts w:ascii="Times New Roman" w:hAnsi="Times New Roman" w:cs="Times New Roman"/>
+          <w:sz w:val="28"/>
+          <w:szCs w:val="28"/>
+        </w:rPr>
+      </w:pPr>
+    </w:p>
+    <w:p>
+      <w:pPr>
+        <w:rPr>
+          <w:rFonts w:ascii="Times New Roman" w:hAnsi="Times New Roman" w:cs="Times New Roman"/>
+          <w:sz w:val="28"/>
+          <w:szCs w:val="28"/>
+        </w:rPr>
+      </w:pPr>
+    </w:p>
+    <w:p>
+      <w:pPr>
+        <w:rPr>
+          <w:rFonts w:ascii="Times New Roman" w:hAnsi="Times New Roman" w:cs="Times New Roman"/>
+          <w:sz w:val="28"/>
+          <w:szCs w:val="28"/>
+        </w:rPr>
+      </w:pPr>
+    </w:p>
+    <w:p>
+      <w:pPr>
+        <w:rPr>
+          <w:rFonts w:ascii="Times New Roman" w:hAnsi="Times New Roman" w:cs="Times New Roman"/>
+          <w:b/>
+          <w:bCs/>
+          <w:color w:val="EE0000"/>
+          <w:sz w:val="28"/>
+          <w:szCs w:val="28"/>
+        </w:rPr>
+      </w:pPr>
+      <w:r>
+        <w:rPr>
+          <w:rFonts w:ascii="Times New Roman" w:hAnsi="Times New Roman" w:cs="Times New Roman"/>
+          <w:b/>
+          <w:bCs/>
+          <w:color w:val="EE0000"/>
+          <w:sz w:val="28"/>
+          <w:szCs w:val="28"/>
+        </w:rPr>
+        <w:t>2) Quelles informations seront affichées (exactement)</w:t>
+      </w:r>
+    </w:p>
+    <w:p>
+      <w:pPr>
+        <w:rPr>
+          <w:rFonts w:ascii="Times New Roman" w:hAnsi="Times New Roman" w:cs="Times New Roman"/>
+          <w:color w:val="EE0000"/>
+          <w:sz w:val="28"/>
+          <w:szCs w:val="28"/>
+        </w:rPr>
+      </w:pPr>
+      <w:r>
+        <w:rPr>
+          <w:rFonts w:ascii="Times New Roman" w:hAnsi="Times New Roman" w:cs="Times New Roman"/>
+          <w:color w:val="EE0000"/>
+          <w:sz w:val="28"/>
+          <w:szCs w:val="28"/>
+        </w:rPr>
+        <w:t xml:space="preserve">Selon ton </w:t>
+      </w:r>
+      <w:proofErr w:type="spellStart"/>
+      <w:r>
+        <w:rPr>
+          <w:rFonts w:ascii="Times New Roman" w:hAnsi="Times New Roman" w:cs="Times New Roman"/>
+          <w:color w:val="EE0000"/>
+          <w:sz w:val="28"/>
+          <w:szCs w:val="28"/>
+        </w:rPr>
+        <w:t>CdC</w:t>
+      </w:r>
+      <w:proofErr w:type="spellEnd"/>
+      <w:r>
+        <w:rPr>
+          <w:rFonts w:ascii="Times New Roman" w:hAnsi="Times New Roman" w:cs="Times New Roman"/>
+          <w:color w:val="EE0000"/>
+          <w:sz w:val="28"/>
+          <w:szCs w:val="28"/>
+        </w:rPr>
+        <w:t>, l’événement minimal par frame / par seconde contient :</w:t>
+      </w:r>
+    </w:p>
+    <w:p>
+      <w:pPr>
+        <w:rPr>
+          <w:rFonts w:ascii="Times New Roman" w:hAnsi="Times New Roman" w:cs="Times New Roman"/>
+          <w:color w:val="EE0000"/>
+          <w:sz w:val="28"/>
+          <w:szCs w:val="28"/>
+        </w:rPr>
+      </w:pPr>
+      <w:r>
+        <w:rPr>
+          <w:rFonts w:ascii="Segoe UI Emoji" w:hAnsi="Segoe UI Emoji" w:cs="Segoe UI Emoji"/>
+          <w:color w:val="EE0000"/>
+          <w:sz w:val="28"/>
+          <w:szCs w:val="28"/>
+        </w:rPr>
+        <w:t>✅</w:t>
+      </w:r>
+      <w:r>
+        <w:rPr>
+          <w:rFonts w:ascii="Times New Roman" w:hAnsi="Times New Roman" w:cs="Times New Roman"/>
+          <w:color w:val="EE0000"/>
+          <w:sz w:val="28"/>
+          <w:szCs w:val="28"/>
+        </w:rPr>
+        <w:t xml:space="preserve"> Champs affichés dans le tableau :</w:t>
+      </w:r>
+    </w:p>
+    <w:p>
+      <w:pPr>
+        <w:numPr>
+          <w:ilvl w:val="0"/>
+          <w:numId w:val="46"/>
+        </w:numPr>
+        <w:rPr>
+          <w:rFonts w:ascii="Times New Roman" w:hAnsi="Times New Roman" w:cs="Times New Roman"/>
+          <w:color w:val="EE0000"/>
+          <w:sz w:val="28"/>
+          <w:szCs w:val="28"/>
+        </w:rPr>
+      </w:pPr>
+      <w:r>
+        <w:rPr>
+          <w:rFonts w:ascii="Times New Roman" w:hAnsi="Times New Roman" w:cs="Times New Roman"/>
+          <w:color w:val="EE0000"/>
+          <w:sz w:val="28"/>
+          <w:szCs w:val="28"/>
+        </w:rPr>
+        <w:t xml:space="preserve">timestamp / </w:t>
+      </w:r>
+      <w:proofErr w:type="spellStart"/>
+      <w:r>
+        <w:rPr>
+          <w:rFonts w:ascii="Times New Roman" w:hAnsi="Times New Roman" w:cs="Times New Roman"/>
+          <w:color w:val="EE0000"/>
+          <w:sz w:val="28"/>
+          <w:szCs w:val="28"/>
+        </w:rPr>
+        <w:t>event_time</w:t>
+      </w:r>
+      <w:proofErr w:type="spellEnd"/>
+      <w:r>
+        <w:rPr>
+          <w:rFonts w:ascii="Times New Roman" w:hAnsi="Times New Roman" w:cs="Times New Roman"/>
+          <w:color w:val="EE0000"/>
+          <w:sz w:val="28"/>
+          <w:szCs w:val="28"/>
+        </w:rPr>
+        <w:t xml:space="preserve"> : quand l’émotion a été détectée</w:t>
+      </w:r>
+    </w:p>
+    <w:p>
+      <w:pPr>
+        <w:numPr>
+          <w:ilvl w:val="0"/>
+          <w:numId w:val="46"/>
+        </w:numPr>
+        <w:rPr>
+          <w:rFonts w:ascii="Times New Roman" w:hAnsi="Times New Roman" w:cs="Times New Roman"/>
+          <w:color w:val="EE0000"/>
+          <w:sz w:val="28"/>
+          <w:szCs w:val="28"/>
+        </w:rPr>
+      </w:pPr>
+      <w:proofErr w:type="spellStart"/>
+      <w:r>
+        <w:rPr>
+          <w:rFonts w:ascii="Times New Roman" w:hAnsi="Times New Roman" w:cs="Times New Roman"/>
+          <w:color w:val="EE0000"/>
+          <w:sz w:val="28"/>
+          <w:szCs w:val="28"/>
+        </w:rPr>
+        <w:t>source_id</w:t>
+      </w:r>
+      <w:proofErr w:type="spellEnd"/>
+      <w:r>
+        <w:rPr>
+          <w:rFonts w:ascii="Times New Roman" w:hAnsi="Times New Roman" w:cs="Times New Roman"/>
+          <w:color w:val="EE0000"/>
+          <w:sz w:val="28"/>
+          <w:szCs w:val="28"/>
+        </w:rPr>
+        <w:t xml:space="preserve"> : quelle caméra / source</w:t>
+      </w:r>
+    </w:p>
+    <w:p>
+      <w:pPr>
+        <w:numPr>
+          <w:ilvl w:val="0"/>
+          <w:numId w:val="46"/>
+        </w:numPr>
+        <w:rPr>
+          <w:rFonts w:ascii="Times New Roman" w:hAnsi="Times New Roman" w:cs="Times New Roman"/>
+          <w:color w:val="EE0000"/>
+          <w:sz w:val="28"/>
+          <w:szCs w:val="28"/>
+          <w:lang w:val="en-US"/>
+        </w:rPr>
+      </w:pPr>
+      <w:r>
+        <w:rPr>
+          <w:rFonts w:ascii="Times New Roman" w:hAnsi="Times New Roman" w:cs="Times New Roman"/>
+          <w:color w:val="EE0000"/>
+          <w:sz w:val="28"/>
+          <w:szCs w:val="28"/>
+          <w:lang w:val="en-US"/>
+        </w:rPr>
+        <w:t>emotion : étiquette (happy, sad, angry, neutral, …)</w:t>
+      </w:r>
+    </w:p>
+    <w:p>
+      <w:pPr>
+        <w:numPr>
+          <w:ilvl w:val="0"/>
+          <w:numId w:val="46"/>
+        </w:numPr>
+        <w:rPr>
+          <w:rFonts w:ascii="Times New Roman" w:hAnsi="Times New Roman" w:cs="Times New Roman"/>
+          <w:color w:val="EE0000"/>
+          <w:sz w:val="28"/>
+          <w:szCs w:val="28"/>
+        </w:rPr>
+      </w:pPr>
+      <w:r>
+        <w:rPr>
+          <w:rFonts w:ascii="Times New Roman" w:hAnsi="Times New Roman" w:cs="Times New Roman"/>
+          <w:color w:val="EE0000"/>
+          <w:sz w:val="28"/>
+          <w:szCs w:val="28"/>
+        </w:rPr>
+        <w:t>score : probabilité / confiance</w:t>
+      </w:r>
+    </w:p>
+    <w:p>
+      <w:pPr>
+        <w:rPr>
+          <w:rFonts w:ascii="Times New Roman" w:hAnsi="Times New Roman" w:cs="Times New Roman"/>
+          <w:color w:val="EE0000"/>
+          <w:sz w:val="28"/>
+          <w:szCs w:val="28"/>
+        </w:rPr>
+      </w:pPr>
+      <w:r>
+        <w:rPr>
+          <w:rFonts w:ascii="Times New Roman" w:hAnsi="Times New Roman" w:cs="Times New Roman"/>
+          <w:color w:val="EE0000"/>
+          <w:sz w:val="28"/>
+          <w:szCs w:val="28"/>
+        </w:rPr>
+        <w:t>Option “plus pro” (qu’on ajoutera quand on branchera la vidéo) :</w:t>
+      </w:r>
+    </w:p>
+    <w:p>
+      <w:pPr>
+        <w:numPr>
+          <w:ilvl w:val="0"/>
+          <w:numId w:val="47"/>
+        </w:numPr>
+        <w:rPr>
+          <w:rFonts w:ascii="Times New Roman" w:hAnsi="Times New Roman" w:cs="Times New Roman"/>
+          <w:color w:val="EE0000"/>
+          <w:sz w:val="28"/>
+          <w:szCs w:val="28"/>
+        </w:rPr>
+      </w:pPr>
+      <w:proofErr w:type="spellStart"/>
+      <w:r>
+        <w:rPr>
+          <w:rFonts w:ascii="Times New Roman" w:hAnsi="Times New Roman" w:cs="Times New Roman"/>
+          <w:color w:val="EE0000"/>
+          <w:sz w:val="28"/>
+          <w:szCs w:val="28"/>
+        </w:rPr>
+        <w:lastRenderedPageBreak/>
+        <w:t>bbox</w:t>
+      </w:r>
+      <w:proofErr w:type="spellEnd"/>
+      <w:r>
+        <w:rPr>
+          <w:rFonts w:ascii="Times New Roman" w:hAnsi="Times New Roman" w:cs="Times New Roman"/>
+          <w:color w:val="EE0000"/>
+          <w:sz w:val="28"/>
+          <w:szCs w:val="28"/>
+        </w:rPr>
+        <w:t xml:space="preserve"> : coordonnées du visage (x, y, w, h)</w:t>
+      </w:r>
+    </w:p>
+    <w:p>
+      <w:pPr>
+        <w:numPr>
+          <w:ilvl w:val="0"/>
+          <w:numId w:val="47"/>
+        </w:numPr>
+        <w:rPr>
+          <w:rFonts w:ascii="Times New Roman" w:hAnsi="Times New Roman" w:cs="Times New Roman"/>
+          <w:color w:val="EE0000"/>
+          <w:sz w:val="28"/>
+          <w:szCs w:val="28"/>
+        </w:rPr>
+      </w:pPr>
+      <w:proofErr w:type="spellStart"/>
+      <w:r>
+        <w:rPr>
+          <w:rFonts w:ascii="Times New Roman" w:hAnsi="Times New Roman" w:cs="Times New Roman"/>
+          <w:color w:val="EE0000"/>
+          <w:sz w:val="28"/>
+          <w:szCs w:val="28"/>
+        </w:rPr>
+        <w:t>face_id</w:t>
+      </w:r>
+      <w:proofErr w:type="spellEnd"/>
+      <w:r>
+        <w:rPr>
+          <w:rFonts w:ascii="Times New Roman" w:hAnsi="Times New Roman" w:cs="Times New Roman"/>
+          <w:color w:val="EE0000"/>
+          <w:sz w:val="28"/>
+          <w:szCs w:val="28"/>
+        </w:rPr>
+        <w:t xml:space="preserve"> : ID si on suit une personne (</w:t>
+      </w:r>
+      <w:proofErr w:type="spellStart"/>
+      <w:r>
+        <w:rPr>
+          <w:rFonts w:ascii="Times New Roman" w:hAnsi="Times New Roman" w:cs="Times New Roman"/>
+          <w:color w:val="EE0000"/>
+          <w:sz w:val="28"/>
+          <w:szCs w:val="28"/>
+        </w:rPr>
+        <w:t>tracking</w:t>
+      </w:r>
+      <w:proofErr w:type="spellEnd"/>
+      <w:r>
+        <w:rPr>
+          <w:rFonts w:ascii="Times New Roman" w:hAnsi="Times New Roman" w:cs="Times New Roman"/>
+          <w:color w:val="EE0000"/>
+          <w:sz w:val="28"/>
+          <w:szCs w:val="28"/>
+        </w:rPr>
+        <w:t>)</w:t>
+      </w:r>
+    </w:p>
+    <w:p>
+      <w:pPr>
+        <w:numPr>
+          <w:ilvl w:val="0"/>
+          <w:numId w:val="47"/>
+        </w:numPr>
+        <w:rPr>
+          <w:rFonts w:ascii="Times New Roman" w:hAnsi="Times New Roman" w:cs="Times New Roman"/>
+          <w:color w:val="EE0000"/>
+          <w:sz w:val="28"/>
+          <w:szCs w:val="28"/>
+        </w:rPr>
+      </w:pPr>
+      <w:proofErr w:type="spellStart"/>
+      <w:r>
+        <w:rPr>
+          <w:rFonts w:ascii="Times New Roman" w:hAnsi="Times New Roman" w:cs="Times New Roman"/>
+          <w:color w:val="EE0000"/>
+          <w:sz w:val="28"/>
+          <w:szCs w:val="28"/>
+        </w:rPr>
+        <w:t>frame_id</w:t>
+      </w:r>
+      <w:proofErr w:type="spellEnd"/>
+      <w:r>
+        <w:rPr>
+          <w:rFonts w:ascii="Times New Roman" w:hAnsi="Times New Roman" w:cs="Times New Roman"/>
+          <w:color w:val="EE0000"/>
+          <w:sz w:val="28"/>
+          <w:szCs w:val="28"/>
+        </w:rPr>
+        <w:t xml:space="preserve"> : numéro de frame</w:t>
+      </w:r>
+    </w:p>
+    <w:p>
+      <w:pPr>
+        <w:numPr>
+          <w:ilvl w:val="0"/>
+          <w:numId w:val="47"/>
+        </w:numPr>
+        <w:rPr>
+          <w:rFonts w:ascii="Times New Roman" w:hAnsi="Times New Roman" w:cs="Times New Roman"/>
+          <w:color w:val="EE0000"/>
+          <w:sz w:val="28"/>
+          <w:szCs w:val="28"/>
+        </w:rPr>
+      </w:pPr>
+      <w:proofErr w:type="spellStart"/>
+      <w:r>
+        <w:rPr>
+          <w:rFonts w:ascii="Times New Roman" w:hAnsi="Times New Roman" w:cs="Times New Roman"/>
+          <w:color w:val="EE0000"/>
+          <w:sz w:val="28"/>
+          <w:szCs w:val="28"/>
+        </w:rPr>
+        <w:t>processing_time_ms</w:t>
+      </w:r>
+      <w:proofErr w:type="spellEnd"/>
+      <w:r>
+        <w:rPr>
+          <w:rFonts w:ascii="Times New Roman" w:hAnsi="Times New Roman" w:cs="Times New Roman"/>
+          <w:color w:val="EE0000"/>
+          <w:sz w:val="28"/>
+          <w:szCs w:val="28"/>
+        </w:rPr>
+        <w:t xml:space="preserve"> : temps d’inférence</w:t>
+      </w:r>
+    </w:p>
+    <w:p>
+      <w:pPr>
+        <w:numPr>
+          <w:ilvl w:val="0"/>
+          <w:numId w:val="47"/>
+        </w:numPr>
+        <w:rPr>
+          <w:rFonts w:ascii="Times New Roman" w:hAnsi="Times New Roman" w:cs="Times New Roman"/>
+          <w:color w:val="EE0000"/>
+          <w:sz w:val="28"/>
+          <w:szCs w:val="28"/>
+        </w:rPr>
+      </w:pPr>
+      <w:r>
+        <w:rPr>
+          <w:rFonts w:ascii="Times New Roman" w:hAnsi="Times New Roman" w:cs="Times New Roman"/>
+          <w:color w:val="EE0000"/>
+          <w:sz w:val="28"/>
+          <w:szCs w:val="28"/>
+        </w:rPr>
+        <w:t>e2e_latency_ms : latence de bout en bout</w:t>
+      </w:r>
+    </w:p>
+    <w:p>
+      <w:pPr>
+        <w:rPr>
+          <w:rFonts w:ascii="Times New Roman" w:hAnsi="Times New Roman" w:cs="Times New Roman"/>
+          <w:color w:val="EE0000"/>
+          <w:sz w:val="28"/>
+          <w:szCs w:val="28"/>
+        </w:rPr>
+      </w:pPr>
+    </w:p>
+    <w:p>
+      <w:pPr>
+        <w:rPr>
+          <w:rFonts w:ascii="Times New Roman" w:hAnsi="Times New Roman" w:cs="Times New Roman"/>
+          <w:sz w:val="28"/>
+          <w:szCs w:val="28"/>
+        </w:rPr>
+      </w:pPr>
     </w:p>
     <w:sectPr>
       <w:pgSz w:w="11906" w:h="16838"/>
@@ -13357,6 +13258,155 @@
     </w:lvl>
   </w:abstractNum>
   <w:abstractNum w:abstractNumId="9" w15:restartNumberingAfterBreak="0">
+    <w:nsid w:val="0FAD042D"/>
+    <w:multiLevelType w:val="multilevel"/>
+    <w:tmpl w:val="DEA61A32"/>
+    <w:lvl w:ilvl="0">
+      <w:start w:val="1"/>
+      <w:numFmt w:val="bullet"/>
+      <w:lvlText w:val=""/>
+      <w:lvlJc w:val="left"/>
+      <w:pPr>
+        <w:tabs>
+          <w:tab w:val="num" w:pos="720"/>
+        </w:tabs>
+        <w:ind w:left="720" w:hanging="360"/>
+      </w:pPr>
+      <w:rPr>
+        <w:rFonts w:ascii="Symbol" w:hAnsi="Symbol" w:hint="default"/>
+        <w:sz w:val="20"/>
+      </w:rPr>
+    </w:lvl>
+    <w:lvl w:ilvl="1" w:tentative="1">
+      <w:start w:val="1"/>
+      <w:numFmt w:val="bullet"/>
+      <w:lvlText w:val="o"/>
+      <w:lvlJc w:val="left"/>
+      <w:pPr>
+        <w:tabs>
+          <w:tab w:val="num" w:pos="1440"/>
+        </w:tabs>
+        <w:ind w:left="1440" w:hanging="360"/>
+      </w:pPr>
+      <w:rPr>
+        <w:rFonts w:ascii="Courier New" w:hAnsi="Courier New" w:hint="default"/>
+        <w:sz w:val="20"/>
+      </w:rPr>
+    </w:lvl>
+    <w:lvl w:ilvl="2" w:tentative="1">
+      <w:start w:val="1"/>
+      <w:numFmt w:val="bullet"/>
+      <w:lvlText w:val=""/>
+      <w:lvlJc w:val="left"/>
+      <w:pPr>
+        <w:tabs>
+          <w:tab w:val="num" w:pos="2160"/>
+        </w:tabs>
+        <w:ind w:left="2160" w:hanging="360"/>
+      </w:pPr>
+      <w:rPr>
+        <w:rFonts w:ascii="Wingdings" w:hAnsi="Wingdings" w:hint="default"/>
+        <w:sz w:val="20"/>
+      </w:rPr>
+    </w:lvl>
+    <w:lvl w:ilvl="3" w:tentative="1">
+      <w:start w:val="1"/>
+      <w:numFmt w:val="bullet"/>
+      <w:lvlText w:val=""/>
+      <w:lvlJc w:val="left"/>
+      <w:pPr>
+        <w:tabs>
+          <w:tab w:val="num" w:pos="2880"/>
+        </w:tabs>
+        <w:ind w:left="2880" w:hanging="360"/>
+      </w:pPr>
+      <w:rPr>
+        <w:rFonts w:ascii="Wingdings" w:hAnsi="Wingdings" w:hint="default"/>
+        <w:sz w:val="20"/>
+      </w:rPr>
+    </w:lvl>
+    <w:lvl w:ilvl="4" w:tentative="1">
+      <w:start w:val="1"/>
+      <w:numFmt w:val="bullet"/>
+      <w:lvlText w:val=""/>
+      <w:lvlJc w:val="left"/>
+      <w:pPr>
+        <w:tabs>
+          <w:tab w:val="num" w:pos="3600"/>
+        </w:tabs>
+        <w:ind w:left="3600" w:hanging="360"/>
+      </w:pPr>
+      <w:rPr>
+        <w:rFonts w:ascii="Wingdings" w:hAnsi="Wingdings" w:hint="default"/>
+        <w:sz w:val="20"/>
+      </w:rPr>
+    </w:lvl>
+    <w:lvl w:ilvl="5" w:tentative="1">
+      <w:start w:val="1"/>
+      <w:numFmt w:val="bullet"/>
+      <w:lvlText w:val=""/>
+      <w:lvlJc w:val="left"/>
+      <w:pPr>
+        <w:tabs>
+          <w:tab w:val="num" w:pos="4320"/>
+        </w:tabs>
+        <w:ind w:left="4320" w:hanging="360"/>
+      </w:pPr>
+      <w:rPr>
+        <w:rFonts w:ascii="Wingdings" w:hAnsi="Wingdings" w:hint="default"/>
+        <w:sz w:val="20"/>
+      </w:rPr>
+    </w:lvl>
+    <w:lvl w:ilvl="6" w:tentative="1">
+      <w:start w:val="1"/>
+      <w:numFmt w:val="bullet"/>
+      <w:lvlText w:val=""/>
+      <w:lvlJc w:val="left"/>
+      <w:pPr>
+        <w:tabs>
+          <w:tab w:val="num" w:pos="5040"/>
+        </w:tabs>
+        <w:ind w:left="5040" w:hanging="360"/>
+      </w:pPr>
+      <w:rPr>
+        <w:rFonts w:ascii="Wingdings" w:hAnsi="Wingdings" w:hint="default"/>
+        <w:sz w:val="20"/>
+      </w:rPr>
+    </w:lvl>
+    <w:lvl w:ilvl="7" w:tentative="1">
+      <w:start w:val="1"/>
+      <w:numFmt w:val="bullet"/>
+      <w:lvlText w:val=""/>
+      <w:lvlJc w:val="left"/>
+      <w:pPr>
+        <w:tabs>
+          <w:tab w:val="num" w:pos="5760"/>
+        </w:tabs>
+        <w:ind w:left="5760" w:hanging="360"/>
+      </w:pPr>
+      <w:rPr>
+        <w:rFonts w:ascii="Wingdings" w:hAnsi="Wingdings" w:hint="default"/>
+        <w:sz w:val="20"/>
+      </w:rPr>
+    </w:lvl>
+    <w:lvl w:ilvl="8" w:tentative="1">
+      <w:start w:val="1"/>
+      <w:numFmt w:val="bullet"/>
+      <w:lvlText w:val=""/>
+      <w:lvlJc w:val="left"/>
+      <w:pPr>
+        <w:tabs>
+          <w:tab w:val="num" w:pos="6480"/>
+        </w:tabs>
+        <w:ind w:left="6480" w:hanging="360"/>
+      </w:pPr>
+      <w:rPr>
+        <w:rFonts w:ascii="Wingdings" w:hAnsi="Wingdings" w:hint="default"/>
+        <w:sz w:val="20"/>
+      </w:rPr>
+    </w:lvl>
+  </w:abstractNum>
+  <w:abstractNum w:abstractNumId="10" w15:restartNumberingAfterBreak="0">
     <w:nsid w:val="150924B6"/>
     <w:multiLevelType w:val="multilevel"/>
     <w:tmpl w:val="2BEA0046"/>
@@ -13505,7 +13555,7 @@
       </w:rPr>
     </w:lvl>
   </w:abstractNum>
-  <w:abstractNum w:abstractNumId="10" w15:restartNumberingAfterBreak="0">
+  <w:abstractNum w:abstractNumId="11" w15:restartNumberingAfterBreak="0">
     <w:nsid w:val="16E92FE9"/>
     <w:multiLevelType w:val="multilevel"/>
     <w:tmpl w:val="89A0356E"/>
@@ -13654,7 +13704,7 @@
       </w:rPr>
     </w:lvl>
   </w:abstractNum>
-  <w:abstractNum w:abstractNumId="11" w15:restartNumberingAfterBreak="0">
+  <w:abstractNum w:abstractNumId="12" w15:restartNumberingAfterBreak="0">
     <w:nsid w:val="192E31B8"/>
     <w:multiLevelType w:val="multilevel"/>
     <w:tmpl w:val="4B66DB96"/>
@@ -13803,7 +13853,7 @@
       </w:rPr>
     </w:lvl>
   </w:abstractNum>
-  <w:abstractNum w:abstractNumId="12" w15:restartNumberingAfterBreak="0">
+  <w:abstractNum w:abstractNumId="13" w15:restartNumberingAfterBreak="0">
     <w:nsid w:val="1AF01229"/>
     <w:multiLevelType w:val="multilevel"/>
     <w:tmpl w:val="D21C1362"/>
@@ -13952,7 +14002,7 @@
       </w:rPr>
     </w:lvl>
   </w:abstractNum>
-  <w:abstractNum w:abstractNumId="13" w15:restartNumberingAfterBreak="0">
+  <w:abstractNum w:abstractNumId="14" w15:restartNumberingAfterBreak="0">
     <w:nsid w:val="1B8B593F"/>
     <w:multiLevelType w:val="multilevel"/>
     <w:tmpl w:val="2F7E3BAC"/>
@@ -14101,7 +14151,7 @@
       </w:rPr>
     </w:lvl>
   </w:abstractNum>
-  <w:abstractNum w:abstractNumId="14" w15:restartNumberingAfterBreak="0">
+  <w:abstractNum w:abstractNumId="15" w15:restartNumberingAfterBreak="0">
     <w:nsid w:val="1C8C6A32"/>
     <w:multiLevelType w:val="multilevel"/>
     <w:tmpl w:val="7F4E3262"/>
@@ -14218,7 +14268,7 @@
       </w:pPr>
     </w:lvl>
   </w:abstractNum>
-  <w:abstractNum w:abstractNumId="15" w15:restartNumberingAfterBreak="0">
+  <w:abstractNum w:abstractNumId="16" w15:restartNumberingAfterBreak="0">
     <w:nsid w:val="1D7A0AD1"/>
     <w:multiLevelType w:val="multilevel"/>
     <w:tmpl w:val="2A9AD2AE"/>
@@ -14335,7 +14385,7 @@
       </w:pPr>
     </w:lvl>
   </w:abstractNum>
-  <w:abstractNum w:abstractNumId="16" w15:restartNumberingAfterBreak="0">
+  <w:abstractNum w:abstractNumId="17" w15:restartNumberingAfterBreak="0">
     <w:nsid w:val="226254EE"/>
     <w:multiLevelType w:val="multilevel"/>
     <w:tmpl w:val="F83A5FD6"/>
@@ -14484,7 +14534,7 @@
       </w:rPr>
     </w:lvl>
   </w:abstractNum>
-  <w:abstractNum w:abstractNumId="17" w15:restartNumberingAfterBreak="0">
+  <w:abstractNum w:abstractNumId="18" w15:restartNumberingAfterBreak="0">
     <w:nsid w:val="230E01B8"/>
     <w:multiLevelType w:val="multilevel"/>
     <w:tmpl w:val="37DA1544"/>
@@ -14633,7 +14683,7 @@
       </w:rPr>
     </w:lvl>
   </w:abstractNum>
-  <w:abstractNum w:abstractNumId="18" w15:restartNumberingAfterBreak="0">
+  <w:abstractNum w:abstractNumId="19" w15:restartNumberingAfterBreak="0">
     <w:nsid w:val="29335264"/>
     <w:multiLevelType w:val="multilevel"/>
     <w:tmpl w:val="096011DA"/>
@@ -14782,7 +14832,156 @@
       </w:rPr>
     </w:lvl>
   </w:abstractNum>
-  <w:abstractNum w:abstractNumId="19" w15:restartNumberingAfterBreak="0">
+  <w:abstractNum w:abstractNumId="20" w15:restartNumberingAfterBreak="0">
+    <w:nsid w:val="2E401910"/>
+    <w:multiLevelType w:val="multilevel"/>
+    <w:tmpl w:val="69E4DB74"/>
+    <w:lvl w:ilvl="0">
+      <w:start w:val="1"/>
+      <w:numFmt w:val="bullet"/>
+      <w:lvlText w:val=""/>
+      <w:lvlJc w:val="left"/>
+      <w:pPr>
+        <w:tabs>
+          <w:tab w:val="num" w:pos="720"/>
+        </w:tabs>
+        <w:ind w:left="720" w:hanging="360"/>
+      </w:pPr>
+      <w:rPr>
+        <w:rFonts w:ascii="Symbol" w:hAnsi="Symbol" w:hint="default"/>
+        <w:sz w:val="20"/>
+      </w:rPr>
+    </w:lvl>
+    <w:lvl w:ilvl="1" w:tentative="1">
+      <w:start w:val="1"/>
+      <w:numFmt w:val="bullet"/>
+      <w:lvlText w:val="o"/>
+      <w:lvlJc w:val="left"/>
+      <w:pPr>
+        <w:tabs>
+          <w:tab w:val="num" w:pos="1440"/>
+        </w:tabs>
+        <w:ind w:left="1440" w:hanging="360"/>
+      </w:pPr>
+      <w:rPr>
+        <w:rFonts w:ascii="Courier New" w:hAnsi="Courier New" w:hint="default"/>
+        <w:sz w:val="20"/>
+      </w:rPr>
+    </w:lvl>
+    <w:lvl w:ilvl="2" w:tentative="1">
+      <w:start w:val="1"/>
+      <w:numFmt w:val="bullet"/>
+      <w:lvlText w:val=""/>
+      <w:lvlJc w:val="left"/>
+      <w:pPr>
+        <w:tabs>
+          <w:tab w:val="num" w:pos="2160"/>
+        </w:tabs>
+        <w:ind w:left="2160" w:hanging="360"/>
+      </w:pPr>
+      <w:rPr>
+        <w:rFonts w:ascii="Wingdings" w:hAnsi="Wingdings" w:hint="default"/>
+        <w:sz w:val="20"/>
+      </w:rPr>
+    </w:lvl>
+    <w:lvl w:ilvl="3" w:tentative="1">
+      <w:start w:val="1"/>
+      <w:numFmt w:val="bullet"/>
+      <w:lvlText w:val=""/>
+      <w:lvlJc w:val="left"/>
+      <w:pPr>
+        <w:tabs>
+          <w:tab w:val="num" w:pos="2880"/>
+        </w:tabs>
+        <w:ind w:left="2880" w:hanging="360"/>
+      </w:pPr>
+      <w:rPr>
+        <w:rFonts w:ascii="Wingdings" w:hAnsi="Wingdings" w:hint="default"/>
+        <w:sz w:val="20"/>
+      </w:rPr>
+    </w:lvl>
+    <w:lvl w:ilvl="4" w:tentative="1">
+      <w:start w:val="1"/>
+      <w:numFmt w:val="bullet"/>
+      <w:lvlText w:val=""/>
+      <w:lvlJc w:val="left"/>
+      <w:pPr>
+        <w:tabs>
+          <w:tab w:val="num" w:pos="3600"/>
+        </w:tabs>
+        <w:ind w:left="3600" w:hanging="360"/>
+      </w:pPr>
+      <w:rPr>
+        <w:rFonts w:ascii="Wingdings" w:hAnsi="Wingdings" w:hint="default"/>
+        <w:sz w:val="20"/>
+      </w:rPr>
+    </w:lvl>
+    <w:lvl w:ilvl="5" w:tentative="1">
+      <w:start w:val="1"/>
+      <w:numFmt w:val="bullet"/>
+      <w:lvlText w:val=""/>
+      <w:lvlJc w:val="left"/>
+      <w:pPr>
+        <w:tabs>
+          <w:tab w:val="num" w:pos="4320"/>
+        </w:tabs>
+        <w:ind w:left="4320" w:hanging="360"/>
+      </w:pPr>
+      <w:rPr>
+        <w:rFonts w:ascii="Wingdings" w:hAnsi="Wingdings" w:hint="default"/>
+        <w:sz w:val="20"/>
+      </w:rPr>
+    </w:lvl>
+    <w:lvl w:ilvl="6" w:tentative="1">
+      <w:start w:val="1"/>
+      <w:numFmt w:val="bullet"/>
+      <w:lvlText w:val=""/>
+      <w:lvlJc w:val="left"/>
+      <w:pPr>
+        <w:tabs>
+          <w:tab w:val="num" w:pos="5040"/>
+        </w:tabs>
+        <w:ind w:left="5040" w:hanging="360"/>
+      </w:pPr>
+      <w:rPr>
+        <w:rFonts w:ascii="Wingdings" w:hAnsi="Wingdings" w:hint="default"/>
+        <w:sz w:val="20"/>
+      </w:rPr>
+    </w:lvl>
+    <w:lvl w:ilvl="7" w:tentative="1">
+      <w:start w:val="1"/>
+      <w:numFmt w:val="bullet"/>
+      <w:lvlText w:val=""/>
+      <w:lvlJc w:val="left"/>
+      <w:pPr>
+        <w:tabs>
+          <w:tab w:val="num" w:pos="5760"/>
+        </w:tabs>
+        <w:ind w:left="5760" w:hanging="360"/>
+      </w:pPr>
+      <w:rPr>
+        <w:rFonts w:ascii="Wingdings" w:hAnsi="Wingdings" w:hint="default"/>
+        <w:sz w:val="20"/>
+      </w:rPr>
+    </w:lvl>
+    <w:lvl w:ilvl="8" w:tentative="1">
+      <w:start w:val="1"/>
+      <w:numFmt w:val="bullet"/>
+      <w:lvlText w:val=""/>
+      <w:lvlJc w:val="left"/>
+      <w:pPr>
+        <w:tabs>
+          <w:tab w:val="num" w:pos="6480"/>
+        </w:tabs>
+        <w:ind w:left="6480" w:hanging="360"/>
+      </w:pPr>
+      <w:rPr>
+        <w:rFonts w:ascii="Wingdings" w:hAnsi="Wingdings" w:hint="default"/>
+        <w:sz w:val="20"/>
+      </w:rPr>
+    </w:lvl>
+  </w:abstractNum>
+  <w:abstractNum w:abstractNumId="21" w15:restartNumberingAfterBreak="0">
     <w:nsid w:val="2F480694"/>
     <w:multiLevelType w:val="multilevel"/>
     <w:tmpl w:val="3D64B242"/>
@@ -14931,7 +15130,7 @@
       </w:rPr>
     </w:lvl>
   </w:abstractNum>
-  <w:abstractNum w:abstractNumId="20" w15:restartNumberingAfterBreak="0">
+  <w:abstractNum w:abstractNumId="22" w15:restartNumberingAfterBreak="0">
     <w:nsid w:val="31582896"/>
     <w:multiLevelType w:val="multilevel"/>
     <w:tmpl w:val="6C2ADEEE"/>
@@ -15080,7 +15279,7 @@
       </w:rPr>
     </w:lvl>
   </w:abstractNum>
-  <w:abstractNum w:abstractNumId="21" w15:restartNumberingAfterBreak="0">
+  <w:abstractNum w:abstractNumId="23" w15:restartNumberingAfterBreak="0">
     <w:nsid w:val="35287316"/>
     <w:multiLevelType w:val="multilevel"/>
     <w:tmpl w:val="B00AE388"/>
@@ -15229,7 +15428,7 @@
       </w:rPr>
     </w:lvl>
   </w:abstractNum>
-  <w:abstractNum w:abstractNumId="22" w15:restartNumberingAfterBreak="0">
+  <w:abstractNum w:abstractNumId="24" w15:restartNumberingAfterBreak="0">
     <w:nsid w:val="358E4F8C"/>
     <w:multiLevelType w:val="multilevel"/>
     <w:tmpl w:val="CB7CE28A"/>
@@ -15378,7 +15577,7 @@
       </w:rPr>
     </w:lvl>
   </w:abstractNum>
-  <w:abstractNum w:abstractNumId="23" w15:restartNumberingAfterBreak="0">
+  <w:abstractNum w:abstractNumId="25" w15:restartNumberingAfterBreak="0">
     <w:nsid w:val="362C61FA"/>
     <w:multiLevelType w:val="multilevel"/>
     <w:tmpl w:val="E3920328"/>
@@ -15527,7 +15726,156 @@
       </w:rPr>
     </w:lvl>
   </w:abstractNum>
-  <w:abstractNum w:abstractNumId="24" w15:restartNumberingAfterBreak="0">
+  <w:abstractNum w:abstractNumId="26" w15:restartNumberingAfterBreak="0">
+    <w:nsid w:val="38695885"/>
+    <w:multiLevelType w:val="multilevel"/>
+    <w:tmpl w:val="43B600FE"/>
+    <w:lvl w:ilvl="0">
+      <w:start w:val="1"/>
+      <w:numFmt w:val="bullet"/>
+      <w:lvlText w:val=""/>
+      <w:lvlJc w:val="left"/>
+      <w:pPr>
+        <w:tabs>
+          <w:tab w:val="num" w:pos="720"/>
+        </w:tabs>
+        <w:ind w:left="720" w:hanging="360"/>
+      </w:pPr>
+      <w:rPr>
+        <w:rFonts w:ascii="Symbol" w:hAnsi="Symbol" w:hint="default"/>
+        <w:sz w:val="20"/>
+      </w:rPr>
+    </w:lvl>
+    <w:lvl w:ilvl="1" w:tentative="1">
+      <w:start w:val="1"/>
+      <w:numFmt w:val="bullet"/>
+      <w:lvlText w:val="o"/>
+      <w:lvlJc w:val="left"/>
+      <w:pPr>
+        <w:tabs>
+          <w:tab w:val="num" w:pos="1440"/>
+        </w:tabs>
+        <w:ind w:left="1440" w:hanging="360"/>
+      </w:pPr>
+      <w:rPr>
+        <w:rFonts w:ascii="Courier New" w:hAnsi="Courier New" w:hint="default"/>
+        <w:sz w:val="20"/>
+      </w:rPr>
+    </w:lvl>
+    <w:lvl w:ilvl="2" w:tentative="1">
+      <w:start w:val="1"/>
+      <w:numFmt w:val="bullet"/>
+      <w:lvlText w:val=""/>
+      <w:lvlJc w:val="left"/>
+      <w:pPr>
+        <w:tabs>
+          <w:tab w:val="num" w:pos="2160"/>
+        </w:tabs>
+        <w:ind w:left="2160" w:hanging="360"/>
+      </w:pPr>
+      <w:rPr>
+        <w:rFonts w:ascii="Wingdings" w:hAnsi="Wingdings" w:hint="default"/>
+        <w:sz w:val="20"/>
+      </w:rPr>
+    </w:lvl>
+    <w:lvl w:ilvl="3" w:tentative="1">
+      <w:start w:val="1"/>
+      <w:numFmt w:val="bullet"/>
+      <w:lvlText w:val=""/>
+      <w:lvlJc w:val="left"/>
+      <w:pPr>
+        <w:tabs>
+          <w:tab w:val="num" w:pos="2880"/>
+        </w:tabs>
+        <w:ind w:left="2880" w:hanging="360"/>
+      </w:pPr>
+      <w:rPr>
+        <w:rFonts w:ascii="Wingdings" w:hAnsi="Wingdings" w:hint="default"/>
+        <w:sz w:val="20"/>
+      </w:rPr>
+    </w:lvl>
+    <w:lvl w:ilvl="4" w:tentative="1">
+      <w:start w:val="1"/>
+      <w:numFmt w:val="bullet"/>
+      <w:lvlText w:val=""/>
+      <w:lvlJc w:val="left"/>
+      <w:pPr>
+        <w:tabs>
+          <w:tab w:val="num" w:pos="3600"/>
+        </w:tabs>
+        <w:ind w:left="3600" w:hanging="360"/>
+      </w:pPr>
+      <w:rPr>
+        <w:rFonts w:ascii="Wingdings" w:hAnsi="Wingdings" w:hint="default"/>
+        <w:sz w:val="20"/>
+      </w:rPr>
+    </w:lvl>
+    <w:lvl w:ilvl="5" w:tentative="1">
+      <w:start w:val="1"/>
+      <w:numFmt w:val="bullet"/>
+      <w:lvlText w:val=""/>
+      <w:lvlJc w:val="left"/>
+      <w:pPr>
+        <w:tabs>
+          <w:tab w:val="num" w:pos="4320"/>
+        </w:tabs>
+        <w:ind w:left="4320" w:hanging="360"/>
+      </w:pPr>
+      <w:rPr>
+        <w:rFonts w:ascii="Wingdings" w:hAnsi="Wingdings" w:hint="default"/>
+        <w:sz w:val="20"/>
+      </w:rPr>
+    </w:lvl>
+    <w:lvl w:ilvl="6" w:tentative="1">
+      <w:start w:val="1"/>
+      <w:numFmt w:val="bullet"/>
+      <w:lvlText w:val=""/>
+      <w:lvlJc w:val="left"/>
+      <w:pPr>
+        <w:tabs>
+          <w:tab w:val="num" w:pos="5040"/>
+        </w:tabs>
+        <w:ind w:left="5040" w:hanging="360"/>
+      </w:pPr>
+      <w:rPr>
+        <w:rFonts w:ascii="Wingdings" w:hAnsi="Wingdings" w:hint="default"/>
+        <w:sz w:val="20"/>
+      </w:rPr>
+    </w:lvl>
+    <w:lvl w:ilvl="7" w:tentative="1">
+      <w:start w:val="1"/>
+      <w:numFmt w:val="bullet"/>
+      <w:lvlText w:val=""/>
+      <w:lvlJc w:val="left"/>
+      <w:pPr>
+        <w:tabs>
+          <w:tab w:val="num" w:pos="5760"/>
+        </w:tabs>
+        <w:ind w:left="5760" w:hanging="360"/>
+      </w:pPr>
+      <w:rPr>
+        <w:rFonts w:ascii="Wingdings" w:hAnsi="Wingdings" w:hint="default"/>
+        <w:sz w:val="20"/>
+      </w:rPr>
+    </w:lvl>
+    <w:lvl w:ilvl="8" w:tentative="1">
+      <w:start w:val="1"/>
+      <w:numFmt w:val="bullet"/>
+      <w:lvlText w:val=""/>
+      <w:lvlJc w:val="left"/>
+      <w:pPr>
+        <w:tabs>
+          <w:tab w:val="num" w:pos="6480"/>
+        </w:tabs>
+        <w:ind w:left="6480" w:hanging="360"/>
+      </w:pPr>
+      <w:rPr>
+        <w:rFonts w:ascii="Wingdings" w:hAnsi="Wingdings" w:hint="default"/>
+        <w:sz w:val="20"/>
+      </w:rPr>
+    </w:lvl>
+  </w:abstractNum>
+  <w:abstractNum w:abstractNumId="27" w15:restartNumberingAfterBreak="0">
     <w:nsid w:val="398150EC"/>
     <w:multiLevelType w:val="multilevel"/>
     <w:tmpl w:val="5BBE01B8"/>
@@ -15676,7 +16024,7 @@
       </w:rPr>
     </w:lvl>
   </w:abstractNum>
-  <w:abstractNum w:abstractNumId="25" w15:restartNumberingAfterBreak="0">
+  <w:abstractNum w:abstractNumId="28" w15:restartNumberingAfterBreak="0">
     <w:nsid w:val="40525629"/>
     <w:multiLevelType w:val="multilevel"/>
     <w:tmpl w:val="53E29886"/>
@@ -15825,7 +16173,7 @@
       </w:rPr>
     </w:lvl>
   </w:abstractNum>
-  <w:abstractNum w:abstractNumId="26" w15:restartNumberingAfterBreak="0">
+  <w:abstractNum w:abstractNumId="29" w15:restartNumberingAfterBreak="0">
     <w:nsid w:val="40D85B1E"/>
     <w:multiLevelType w:val="multilevel"/>
     <w:tmpl w:val="93A6B4DE"/>
@@ -15974,7 +16322,7 @@
       </w:rPr>
     </w:lvl>
   </w:abstractNum>
-  <w:abstractNum w:abstractNumId="27" w15:restartNumberingAfterBreak="0">
+  <w:abstractNum w:abstractNumId="30" w15:restartNumberingAfterBreak="0">
     <w:nsid w:val="492D7FCD"/>
     <w:multiLevelType w:val="multilevel"/>
     <w:tmpl w:val="4CF0E3BC"/>
@@ -16123,7 +16471,7 @@
       </w:rPr>
     </w:lvl>
   </w:abstractNum>
-  <w:abstractNum w:abstractNumId="28" w15:restartNumberingAfterBreak="0">
+  <w:abstractNum w:abstractNumId="31" w15:restartNumberingAfterBreak="0">
     <w:nsid w:val="4B2F19C8"/>
     <w:multiLevelType w:val="multilevel"/>
     <w:tmpl w:val="70B67850"/>
@@ -16272,7 +16620,7 @@
       </w:rPr>
     </w:lvl>
   </w:abstractNum>
-  <w:abstractNum w:abstractNumId="29" w15:restartNumberingAfterBreak="0">
+  <w:abstractNum w:abstractNumId="32" w15:restartNumberingAfterBreak="0">
     <w:nsid w:val="525D08CF"/>
     <w:multiLevelType w:val="multilevel"/>
     <w:tmpl w:val="1702155A"/>
@@ -16421,7 +16769,7 @@
       </w:rPr>
     </w:lvl>
   </w:abstractNum>
-  <w:abstractNum w:abstractNumId="30" w15:restartNumberingAfterBreak="0">
+  <w:abstractNum w:abstractNumId="33" w15:restartNumberingAfterBreak="0">
     <w:nsid w:val="592061A1"/>
     <w:multiLevelType w:val="multilevel"/>
     <w:tmpl w:val="59B6303C"/>
@@ -16570,7 +16918,7 @@
       </w:rPr>
     </w:lvl>
   </w:abstractNum>
-  <w:abstractNum w:abstractNumId="31" w15:restartNumberingAfterBreak="0">
+  <w:abstractNum w:abstractNumId="34" w15:restartNumberingAfterBreak="0">
     <w:nsid w:val="5B940F3F"/>
     <w:multiLevelType w:val="multilevel"/>
     <w:tmpl w:val="0C5A24F0"/>
@@ -16719,7 +17067,7 @@
       </w:rPr>
     </w:lvl>
   </w:abstractNum>
-  <w:abstractNum w:abstractNumId="32" w15:restartNumberingAfterBreak="0">
+  <w:abstractNum w:abstractNumId="35" w15:restartNumberingAfterBreak="0">
     <w:nsid w:val="5D27773F"/>
     <w:multiLevelType w:val="multilevel"/>
     <w:tmpl w:val="E57C8288"/>
@@ -16868,7 +17216,7 @@
       </w:rPr>
     </w:lvl>
   </w:abstractNum>
-  <w:abstractNum w:abstractNumId="33" w15:restartNumberingAfterBreak="0">
+  <w:abstractNum w:abstractNumId="36" w15:restartNumberingAfterBreak="0">
     <w:nsid w:val="5DAD00A0"/>
     <w:multiLevelType w:val="multilevel"/>
     <w:tmpl w:val="6C56A554"/>
@@ -17017,7 +17365,7 @@
       </w:rPr>
     </w:lvl>
   </w:abstractNum>
-  <w:abstractNum w:abstractNumId="34" w15:restartNumberingAfterBreak="0">
+  <w:abstractNum w:abstractNumId="37" w15:restartNumberingAfterBreak="0">
     <w:nsid w:val="6023646B"/>
     <w:multiLevelType w:val="multilevel"/>
     <w:tmpl w:val="411ACD08"/>
@@ -17166,7 +17514,7 @@
       </w:rPr>
     </w:lvl>
   </w:abstractNum>
-  <w:abstractNum w:abstractNumId="35" w15:restartNumberingAfterBreak="0">
+  <w:abstractNum w:abstractNumId="38" w15:restartNumberingAfterBreak="0">
     <w:nsid w:val="63807ED4"/>
     <w:multiLevelType w:val="multilevel"/>
     <w:tmpl w:val="A12ECA28"/>
@@ -17315,7 +17663,7 @@
       </w:rPr>
     </w:lvl>
   </w:abstractNum>
-  <w:abstractNum w:abstractNumId="36" w15:restartNumberingAfterBreak="0">
+  <w:abstractNum w:abstractNumId="39" w15:restartNumberingAfterBreak="0">
     <w:nsid w:val="64537D53"/>
     <w:multiLevelType w:val="multilevel"/>
     <w:tmpl w:val="6A3602F6"/>
@@ -17464,7 +17812,7 @@
       </w:rPr>
     </w:lvl>
   </w:abstractNum>
-  <w:abstractNum w:abstractNumId="37" w15:restartNumberingAfterBreak="0">
+  <w:abstractNum w:abstractNumId="40" w15:restartNumberingAfterBreak="0">
     <w:nsid w:val="66616225"/>
     <w:multiLevelType w:val="multilevel"/>
     <w:tmpl w:val="EC3AF250"/>
@@ -17613,7 +17961,7 @@
       </w:rPr>
     </w:lvl>
   </w:abstractNum>
-  <w:abstractNum w:abstractNumId="38" w15:restartNumberingAfterBreak="0">
+  <w:abstractNum w:abstractNumId="41" w15:restartNumberingAfterBreak="0">
     <w:nsid w:val="6B8403E2"/>
     <w:multiLevelType w:val="multilevel"/>
     <w:tmpl w:val="5AE213A8"/>
@@ -17762,7 +18110,7 @@
       </w:rPr>
     </w:lvl>
   </w:abstractNum>
-  <w:abstractNum w:abstractNumId="39" w15:restartNumberingAfterBreak="0">
+  <w:abstractNum w:abstractNumId="42" w15:restartNumberingAfterBreak="0">
     <w:nsid w:val="6C055368"/>
     <w:multiLevelType w:val="multilevel"/>
     <w:tmpl w:val="EEAE1CEA"/>
@@ -17911,7 +18259,7 @@
       </w:rPr>
     </w:lvl>
   </w:abstractNum>
-  <w:abstractNum w:abstractNumId="40" w15:restartNumberingAfterBreak="0">
+  <w:abstractNum w:abstractNumId="43" w15:restartNumberingAfterBreak="0">
     <w:nsid w:val="6FC7782D"/>
     <w:multiLevelType w:val="multilevel"/>
     <w:tmpl w:val="508EED0A"/>
@@ -18060,7 +18408,7 @@
       </w:rPr>
     </w:lvl>
   </w:abstractNum>
-  <w:abstractNum w:abstractNumId="41" w15:restartNumberingAfterBreak="0">
+  <w:abstractNum w:abstractNumId="44" w15:restartNumberingAfterBreak="0">
     <w:nsid w:val="75A04ECD"/>
     <w:multiLevelType w:val="multilevel"/>
     <w:tmpl w:val="A0B25640"/>
@@ -18209,7 +18557,7 @@
       </w:rPr>
     </w:lvl>
   </w:abstractNum>
-  <w:abstractNum w:abstractNumId="42" w15:restartNumberingAfterBreak="0">
+  <w:abstractNum w:abstractNumId="45" w15:restartNumberingAfterBreak="0">
     <w:nsid w:val="76CB0E3F"/>
     <w:multiLevelType w:val="multilevel"/>
     <w:tmpl w:val="947A76DA"/>
@@ -18358,7 +18706,7 @@
       </w:rPr>
     </w:lvl>
   </w:abstractNum>
-  <w:abstractNum w:abstractNumId="43" w15:restartNumberingAfterBreak="0">
+  <w:abstractNum w:abstractNumId="46" w15:restartNumberingAfterBreak="0">
     <w:nsid w:val="792C68AC"/>
     <w:multiLevelType w:val="multilevel"/>
     <w:tmpl w:val="AE58E9F6"/>
@@ -18511,46 +18859,46 @@
     <w:abstractNumId w:val="2"/>
   </w:num>
   <w:num w:numId="2" w16cid:durableId="1575357271">
+    <w:abstractNumId w:val="12"/>
+  </w:num>
+  <w:num w:numId="3" w16cid:durableId="904143659">
+    <w:abstractNumId w:val="24"/>
+  </w:num>
+  <w:num w:numId="4" w16cid:durableId="1757825459">
+    <w:abstractNumId w:val="33"/>
+  </w:num>
+  <w:num w:numId="5" w16cid:durableId="2048140375">
+    <w:abstractNumId w:val="16"/>
+  </w:num>
+  <w:num w:numId="6" w16cid:durableId="279150287">
+    <w:abstractNumId w:val="37"/>
+  </w:num>
+  <w:num w:numId="7" w16cid:durableId="633100969">
     <w:abstractNumId w:val="11"/>
   </w:num>
-  <w:num w:numId="3" w16cid:durableId="904143659">
-    <w:abstractNumId w:val="22"/>
-  </w:num>
-  <w:num w:numId="4" w16cid:durableId="1757825459">
-    <w:abstractNumId w:val="30"/>
-  </w:num>
-  <w:num w:numId="5" w16cid:durableId="2048140375">
-    <w:abstractNumId w:val="15"/>
-  </w:num>
-  <w:num w:numId="6" w16cid:durableId="279150287">
-    <w:abstractNumId w:val="34"/>
-  </w:num>
-  <w:num w:numId="7" w16cid:durableId="633100969">
-    <w:abstractNumId w:val="10"/>
-  </w:num>
   <w:num w:numId="8" w16cid:durableId="1903559785">
-    <w:abstractNumId w:val="25"/>
+    <w:abstractNumId w:val="28"/>
   </w:num>
   <w:num w:numId="9" w16cid:durableId="1173759440">
-    <w:abstractNumId w:val="38"/>
+    <w:abstractNumId w:val="41"/>
   </w:num>
   <w:num w:numId="10" w16cid:durableId="271977464">
-    <w:abstractNumId w:val="32"/>
+    <w:abstractNumId w:val="35"/>
   </w:num>
   <w:num w:numId="11" w16cid:durableId="284312462">
-    <w:abstractNumId w:val="33"/>
+    <w:abstractNumId w:val="36"/>
   </w:num>
   <w:num w:numId="12" w16cid:durableId="365371801">
-    <w:abstractNumId w:val="40"/>
+    <w:abstractNumId w:val="43"/>
   </w:num>
   <w:num w:numId="13" w16cid:durableId="1333416573">
-    <w:abstractNumId w:val="13"/>
+    <w:abstractNumId w:val="14"/>
   </w:num>
   <w:num w:numId="14" w16cid:durableId="86992">
-    <w:abstractNumId w:val="28"/>
+    <w:abstractNumId w:val="31"/>
   </w:num>
   <w:num w:numId="15" w16cid:durableId="2001228321">
-    <w:abstractNumId w:val="9"/>
+    <w:abstractNumId w:val="10"/>
   </w:num>
   <w:num w:numId="16" w16cid:durableId="1661425126">
     <w:abstractNumId w:val="1"/>
@@ -18562,82 +18910,91 @@
     <w:abstractNumId w:val="0"/>
   </w:num>
   <w:num w:numId="19" w16cid:durableId="934436420">
-    <w:abstractNumId w:val="29"/>
+    <w:abstractNumId w:val="32"/>
   </w:num>
   <w:num w:numId="20" w16cid:durableId="1872036146">
-    <w:abstractNumId w:val="20"/>
+    <w:abstractNumId w:val="22"/>
   </w:num>
   <w:num w:numId="21" w16cid:durableId="1984191544">
-    <w:abstractNumId w:val="42"/>
+    <w:abstractNumId w:val="45"/>
   </w:num>
   <w:num w:numId="22" w16cid:durableId="1332639709">
     <w:abstractNumId w:val="4"/>
   </w:num>
   <w:num w:numId="23" w16cid:durableId="37319280">
-    <w:abstractNumId w:val="12"/>
+    <w:abstractNumId w:val="13"/>
   </w:num>
   <w:num w:numId="24" w16cid:durableId="181210554">
     <w:abstractNumId w:val="6"/>
   </w:num>
   <w:num w:numId="25" w16cid:durableId="614679207">
-    <w:abstractNumId w:val="26"/>
+    <w:abstractNumId w:val="29"/>
   </w:num>
   <w:num w:numId="26" w16cid:durableId="817458206">
-    <w:abstractNumId w:val="23"/>
+    <w:abstractNumId w:val="25"/>
   </w:num>
   <w:num w:numId="27" w16cid:durableId="763956756">
-    <w:abstractNumId w:val="14"/>
+    <w:abstractNumId w:val="15"/>
   </w:num>
   <w:num w:numId="28" w16cid:durableId="394088958">
-    <w:abstractNumId w:val="24"/>
+    <w:abstractNumId w:val="27"/>
   </w:num>
   <w:num w:numId="29" w16cid:durableId="417365154">
-    <w:abstractNumId w:val="27"/>
+    <w:abstractNumId w:val="30"/>
   </w:num>
   <w:num w:numId="30" w16cid:durableId="210534355">
-    <w:abstractNumId w:val="16"/>
+    <w:abstractNumId w:val="17"/>
   </w:num>
   <w:num w:numId="31" w16cid:durableId="1852144157">
     <w:abstractNumId w:val="3"/>
   </w:num>
   <w:num w:numId="32" w16cid:durableId="1370374589">
-    <w:abstractNumId w:val="39"/>
+    <w:abstractNumId w:val="42"/>
   </w:num>
   <w:num w:numId="33" w16cid:durableId="703674075">
-    <w:abstractNumId w:val="17"/>
+    <w:abstractNumId w:val="18"/>
   </w:num>
   <w:num w:numId="34" w16cid:durableId="1120419845">
+    <w:abstractNumId w:val="23"/>
+  </w:num>
+  <w:num w:numId="35" w16cid:durableId="43334126">
     <w:abstractNumId w:val="21"/>
   </w:num>
-  <w:num w:numId="35" w16cid:durableId="43334126">
+  <w:num w:numId="36" w16cid:durableId="392899306">
     <w:abstractNumId w:val="19"/>
-  </w:num>
-  <w:num w:numId="36" w16cid:durableId="392899306">
-    <w:abstractNumId w:val="18"/>
   </w:num>
   <w:num w:numId="37" w16cid:durableId="1278951180">
     <w:abstractNumId w:val="7"/>
   </w:num>
   <w:num w:numId="38" w16cid:durableId="80413694">
-    <w:abstractNumId w:val="43"/>
+    <w:abstractNumId w:val="46"/>
   </w:num>
   <w:num w:numId="39" w16cid:durableId="1351372460">
-    <w:abstractNumId w:val="37"/>
+    <w:abstractNumId w:val="40"/>
   </w:num>
   <w:num w:numId="40" w16cid:durableId="30501494">
-    <w:abstractNumId w:val="35"/>
+    <w:abstractNumId w:val="38"/>
   </w:num>
   <w:num w:numId="41" w16cid:durableId="1711876181">
     <w:abstractNumId w:val="5"/>
   </w:num>
   <w:num w:numId="42" w16cid:durableId="621227846">
-    <w:abstractNumId w:val="41"/>
+    <w:abstractNumId w:val="44"/>
   </w:num>
   <w:num w:numId="43" w16cid:durableId="1091706053">
-    <w:abstractNumId w:val="31"/>
+    <w:abstractNumId w:val="34"/>
   </w:num>
   <w:num w:numId="44" w16cid:durableId="1915503901">
-    <w:abstractNumId w:val="36"/>
+    <w:abstractNumId w:val="39"/>
+  </w:num>
+  <w:num w:numId="45" w16cid:durableId="1017266913">
+    <w:abstractNumId w:val="20"/>
+  </w:num>
+  <w:num w:numId="46" w16cid:durableId="1140612385">
+    <w:abstractNumId w:val="26"/>
+  </w:num>
+  <w:num w:numId="47" w16cid:durableId="793136626">
+    <w:abstractNumId w:val="9"/>
   </w:num>
 </w:numbering>
 </file>
@@ -19245,7 +19602,6 @@
   <w:style w:type="character" w:default="1" w:styleId="Policepardfaut">
     <w:name w:val="Default Paragraph Font"/>
     <w:uiPriority w:val="1"/>
-    <w:semiHidden/>
     <w:unhideWhenUsed/>
   </w:style>
   <w:style w:type="table" w:default="1" w:styleId="TableauNormal">

</xml_diff>